<commit_message>
add projectiles, first prefabs
</commit_message>
<xml_diff>
--- a/Assets/Docs.docx
+++ b/Assets/Docs.docx
@@ -98,7 +98,7 @@
             </w:rPr>
             <w:fldChar w:fldCharType="separate"/>
           </w:r>
-          <w:hyperlink w:anchor="_Toc223035360" w:history="1">
+          <w:hyperlink w:anchor="_Toc226478108" w:history="1">
             <w:r>
               <w:rPr>
                 <w:rStyle w:val="a4"/>
@@ -125,7 +125,7 @@
                 <w:noProof/>
                 <w:webHidden/>
               </w:rPr>
-              <w:instrText xml:space="preserve"> PAGEREF _Toc223035360 \h </w:instrText>
+              <w:instrText xml:space="preserve"> PAGEREF _Toc226478108 \h </w:instrText>
             </w:r>
             <w:r>
               <w:rPr>
@@ -168,7 +168,7 @@
               <w:lang w:eastAsia="ru-RU"/>
             </w:rPr>
           </w:pPr>
-          <w:hyperlink w:anchor="_Toc223035361" w:history="1">
+          <w:hyperlink w:anchor="_Toc226478109" w:history="1">
             <w:r>
               <w:rPr>
                 <w:rStyle w:val="a4"/>
@@ -195,7 +195,7 @@
                 <w:noProof/>
                 <w:webHidden/>
               </w:rPr>
-              <w:instrText xml:space="preserve"> PAGEREF _Toc223035361 \h </w:instrText>
+              <w:instrText xml:space="preserve"> PAGEREF _Toc226478109 \h </w:instrText>
             </w:r>
             <w:r>
               <w:rPr>
@@ -238,7 +238,7 @@
               <w:lang w:eastAsia="ru-RU"/>
             </w:rPr>
           </w:pPr>
-          <w:hyperlink w:anchor="_Toc223035362" w:history="1">
+          <w:hyperlink w:anchor="_Toc226478110" w:history="1">
             <w:r>
               <w:rPr>
                 <w:rStyle w:val="a4"/>
@@ -265,7 +265,7 @@
                 <w:noProof/>
                 <w:webHidden/>
               </w:rPr>
-              <w:instrText xml:space="preserve"> PAGEREF _Toc223035362 \h </w:instrText>
+              <w:instrText xml:space="preserve"> PAGEREF _Toc226478110 \h </w:instrText>
             </w:r>
             <w:r>
               <w:rPr>
@@ -308,7 +308,7 @@
               <w:lang w:eastAsia="ru-RU"/>
             </w:rPr>
           </w:pPr>
-          <w:hyperlink w:anchor="_Toc223035363" w:history="1">
+          <w:hyperlink w:anchor="_Toc226478111" w:history="1">
             <w:r>
               <w:rPr>
                 <w:rStyle w:val="a4"/>
@@ -343,7 +343,7 @@
                 <w:noProof/>
                 <w:webHidden/>
               </w:rPr>
-              <w:instrText xml:space="preserve"> PAGEREF _Toc223035363 \h </w:instrText>
+              <w:instrText xml:space="preserve"> PAGEREF _Toc226478111 \h </w:instrText>
             </w:r>
             <w:r>
               <w:rPr>
@@ -386,7 +386,7 @@
               <w:lang w:eastAsia="ru-RU"/>
             </w:rPr>
           </w:pPr>
-          <w:hyperlink w:anchor="_Toc223035364" w:history="1">
+          <w:hyperlink w:anchor="_Toc226478112" w:history="1">
             <w:r>
               <w:rPr>
                 <w:rStyle w:val="a4"/>
@@ -413,7 +413,7 @@
                 <w:noProof/>
                 <w:webHidden/>
               </w:rPr>
-              <w:instrText xml:space="preserve"> PAGEREF _Toc223035364 \h </w:instrText>
+              <w:instrText xml:space="preserve"> PAGEREF _Toc226478112 \h </w:instrText>
             </w:r>
             <w:r>
               <w:rPr>
@@ -456,7 +456,7 @@
               <w:lang w:eastAsia="ru-RU"/>
             </w:rPr>
           </w:pPr>
-          <w:hyperlink w:anchor="_Toc223035365" w:history="1">
+          <w:hyperlink w:anchor="_Toc226478113" w:history="1">
             <w:r>
               <w:rPr>
                 <w:rStyle w:val="a4"/>
@@ -483,7 +483,7 @@
                 <w:noProof/>
                 <w:webHidden/>
               </w:rPr>
-              <w:instrText xml:space="preserve"> PAGEREF _Toc223035365 \h </w:instrText>
+              <w:instrText xml:space="preserve"> PAGEREF _Toc226478113 \h </w:instrText>
             </w:r>
             <w:r>
               <w:rPr>
@@ -526,7 +526,7 @@
               <w:lang w:eastAsia="ru-RU"/>
             </w:rPr>
           </w:pPr>
-          <w:hyperlink w:anchor="_Toc223035366" w:history="1">
+          <w:hyperlink w:anchor="_Toc226478114" w:history="1">
             <w:r>
               <w:rPr>
                 <w:rStyle w:val="a4"/>
@@ -553,7 +553,7 @@
                 <w:noProof/>
                 <w:webHidden/>
               </w:rPr>
-              <w:instrText xml:space="preserve"> PAGEREF _Toc223035366 \h </w:instrText>
+              <w:instrText xml:space="preserve"> PAGEREF _Toc226478114 \h </w:instrText>
             </w:r>
             <w:r>
               <w:rPr>
@@ -596,7 +596,7 @@
               <w:lang w:eastAsia="ru-RU"/>
             </w:rPr>
           </w:pPr>
-          <w:hyperlink w:anchor="_Toc223035367" w:history="1">
+          <w:hyperlink w:anchor="_Toc226478115" w:history="1">
             <w:r>
               <w:rPr>
                 <w:rStyle w:val="a4"/>
@@ -623,7 +623,7 @@
                 <w:noProof/>
                 <w:webHidden/>
               </w:rPr>
-              <w:instrText xml:space="preserve"> PAGEREF _Toc223035367 \h </w:instrText>
+              <w:instrText xml:space="preserve"> PAGEREF _Toc226478115 \h </w:instrText>
             </w:r>
             <w:r>
               <w:rPr>
@@ -666,7 +666,7 @@
               <w:lang w:eastAsia="ru-RU"/>
             </w:rPr>
           </w:pPr>
-          <w:hyperlink w:anchor="_Toc223035368" w:history="1">
+          <w:hyperlink w:anchor="_Toc226478116" w:history="1">
             <w:r>
               <w:rPr>
                 <w:rStyle w:val="a4"/>
@@ -693,7 +693,7 @@
                 <w:noProof/>
                 <w:webHidden/>
               </w:rPr>
-              <w:instrText xml:space="preserve"> PAGEREF _Toc223035368 \h </w:instrText>
+              <w:instrText xml:space="preserve"> PAGEREF _Toc226478116 \h </w:instrText>
             </w:r>
             <w:r>
               <w:rPr>
@@ -736,7 +736,7 @@
               <w:lang w:eastAsia="ru-RU"/>
             </w:rPr>
           </w:pPr>
-          <w:hyperlink w:anchor="_Toc223035369" w:history="1">
+          <w:hyperlink w:anchor="_Toc226478117" w:history="1">
             <w:r>
               <w:rPr>
                 <w:rStyle w:val="a4"/>
@@ -763,7 +763,7 @@
                 <w:noProof/>
                 <w:webHidden/>
               </w:rPr>
-              <w:instrText xml:space="preserve"> PAGEREF _Toc223035369 \h </w:instrText>
+              <w:instrText xml:space="preserve"> PAGEREF _Toc226478117 \h </w:instrText>
             </w:r>
             <w:r>
               <w:rPr>
@@ -784,6 +784,286 @@
                 <w:webHidden/>
               </w:rPr>
               <w:t>4</w:t>
+            </w:r>
+            <w:r>
+              <w:rPr>
+                <w:noProof/>
+                <w:webHidden/>
+              </w:rPr>
+              <w:fldChar w:fldCharType="end"/>
+            </w:r>
+          </w:hyperlink>
+        </w:p>
+        <w:p>
+          <w:pPr>
+            <w:pStyle w:val="11"/>
+            <w:tabs>
+              <w:tab w:val="right" w:leader="dot" w:pos="9345"/>
+            </w:tabs>
+            <w:rPr>
+              <w:rFonts w:eastAsiaTheme="minorEastAsia"/>
+              <w:noProof/>
+              <w:lang w:eastAsia="ru-RU"/>
+            </w:rPr>
+          </w:pPr>
+          <w:hyperlink w:anchor="_Toc226478118" w:history="1">
+            <w:r>
+              <w:rPr>
+                <w:rStyle w:val="a4"/>
+                <w:noProof/>
+              </w:rPr>
+              <w:t>Контент</w:t>
+            </w:r>
+            <w:r>
+              <w:rPr>
+                <w:noProof/>
+                <w:webHidden/>
+              </w:rPr>
+              <w:tab/>
+            </w:r>
+            <w:r>
+              <w:rPr>
+                <w:noProof/>
+                <w:webHidden/>
+              </w:rPr>
+              <w:fldChar w:fldCharType="begin"/>
+            </w:r>
+            <w:r>
+              <w:rPr>
+                <w:noProof/>
+                <w:webHidden/>
+              </w:rPr>
+              <w:instrText xml:space="preserve"> PAGEREF _Toc226478118 \h </w:instrText>
+            </w:r>
+            <w:r>
+              <w:rPr>
+                <w:noProof/>
+                <w:webHidden/>
+              </w:rPr>
+            </w:r>
+            <w:r>
+              <w:rPr>
+                <w:noProof/>
+                <w:webHidden/>
+              </w:rPr>
+              <w:fldChar w:fldCharType="separate"/>
+            </w:r>
+            <w:r>
+              <w:rPr>
+                <w:noProof/>
+                <w:webHidden/>
+              </w:rPr>
+              <w:t>5</w:t>
+            </w:r>
+            <w:r>
+              <w:rPr>
+                <w:noProof/>
+                <w:webHidden/>
+              </w:rPr>
+              <w:fldChar w:fldCharType="end"/>
+            </w:r>
+          </w:hyperlink>
+        </w:p>
+        <w:p>
+          <w:pPr>
+            <w:pStyle w:val="21"/>
+            <w:tabs>
+              <w:tab w:val="right" w:leader="dot" w:pos="9345"/>
+            </w:tabs>
+            <w:rPr>
+              <w:rFonts w:eastAsiaTheme="minorEastAsia"/>
+              <w:noProof/>
+              <w:lang w:eastAsia="ru-RU"/>
+            </w:rPr>
+          </w:pPr>
+          <w:hyperlink w:anchor="_Toc226478119" w:history="1">
+            <w:r>
+              <w:rPr>
+                <w:rStyle w:val="a4"/>
+                <w:noProof/>
+              </w:rPr>
+              <w:t>Оружие</w:t>
+            </w:r>
+            <w:r>
+              <w:rPr>
+                <w:noProof/>
+                <w:webHidden/>
+              </w:rPr>
+              <w:tab/>
+            </w:r>
+            <w:r>
+              <w:rPr>
+                <w:noProof/>
+                <w:webHidden/>
+              </w:rPr>
+              <w:fldChar w:fldCharType="begin"/>
+            </w:r>
+            <w:r>
+              <w:rPr>
+                <w:noProof/>
+                <w:webHidden/>
+              </w:rPr>
+              <w:instrText xml:space="preserve"> PAGEREF _Toc226478119 \h </w:instrText>
+            </w:r>
+            <w:r>
+              <w:rPr>
+                <w:noProof/>
+                <w:webHidden/>
+              </w:rPr>
+            </w:r>
+            <w:r>
+              <w:rPr>
+                <w:noProof/>
+                <w:webHidden/>
+              </w:rPr>
+              <w:fldChar w:fldCharType="separate"/>
+            </w:r>
+            <w:r>
+              <w:rPr>
+                <w:noProof/>
+                <w:webHidden/>
+              </w:rPr>
+              <w:t>5</w:t>
+            </w:r>
+            <w:r>
+              <w:rPr>
+                <w:noProof/>
+                <w:webHidden/>
+              </w:rPr>
+              <w:fldChar w:fldCharType="end"/>
+            </w:r>
+          </w:hyperlink>
+        </w:p>
+        <w:p>
+          <w:pPr>
+            <w:pStyle w:val="21"/>
+            <w:tabs>
+              <w:tab w:val="right" w:leader="dot" w:pos="9345"/>
+            </w:tabs>
+            <w:rPr>
+              <w:rFonts w:eastAsiaTheme="minorEastAsia"/>
+              <w:noProof/>
+              <w:lang w:eastAsia="ru-RU"/>
+            </w:rPr>
+          </w:pPr>
+          <w:hyperlink w:anchor="_Toc226478120" w:history="1">
+            <w:r>
+              <w:rPr>
+                <w:rStyle w:val="a4"/>
+                <w:noProof/>
+              </w:rPr>
+              <w:t>Модули</w:t>
+            </w:r>
+            <w:r>
+              <w:rPr>
+                <w:noProof/>
+                <w:webHidden/>
+              </w:rPr>
+              <w:tab/>
+            </w:r>
+            <w:r>
+              <w:rPr>
+                <w:noProof/>
+                <w:webHidden/>
+              </w:rPr>
+              <w:fldChar w:fldCharType="begin"/>
+            </w:r>
+            <w:r>
+              <w:rPr>
+                <w:noProof/>
+                <w:webHidden/>
+              </w:rPr>
+              <w:instrText xml:space="preserve"> PAGEREF _Toc226478120 \h </w:instrText>
+            </w:r>
+            <w:r>
+              <w:rPr>
+                <w:noProof/>
+                <w:webHidden/>
+              </w:rPr>
+            </w:r>
+            <w:r>
+              <w:rPr>
+                <w:noProof/>
+                <w:webHidden/>
+              </w:rPr>
+              <w:fldChar w:fldCharType="separate"/>
+            </w:r>
+            <w:r>
+              <w:rPr>
+                <w:noProof/>
+                <w:webHidden/>
+              </w:rPr>
+              <w:t>6</w:t>
+            </w:r>
+            <w:r>
+              <w:rPr>
+                <w:noProof/>
+                <w:webHidden/>
+              </w:rPr>
+              <w:fldChar w:fldCharType="end"/>
+            </w:r>
+          </w:hyperlink>
+        </w:p>
+        <w:p>
+          <w:pPr>
+            <w:pStyle w:val="21"/>
+            <w:tabs>
+              <w:tab w:val="right" w:leader="dot" w:pos="9345"/>
+            </w:tabs>
+            <w:rPr>
+              <w:rFonts w:eastAsiaTheme="minorEastAsia"/>
+              <w:noProof/>
+              <w:lang w:eastAsia="ru-RU"/>
+            </w:rPr>
+          </w:pPr>
+          <w:hyperlink w:anchor="_Toc226478121" w:history="1">
+            <w:r>
+              <w:rPr>
+                <w:rStyle w:val="a4"/>
+                <w:noProof/>
+              </w:rPr>
+              <w:t>Враги</w:t>
+            </w:r>
+            <w:r>
+              <w:rPr>
+                <w:noProof/>
+                <w:webHidden/>
+              </w:rPr>
+              <w:tab/>
+            </w:r>
+            <w:r>
+              <w:rPr>
+                <w:noProof/>
+                <w:webHidden/>
+              </w:rPr>
+              <w:fldChar w:fldCharType="begin"/>
+            </w:r>
+            <w:r>
+              <w:rPr>
+                <w:noProof/>
+                <w:webHidden/>
+              </w:rPr>
+              <w:instrText xml:space="preserve"> PAGEREF _Toc226478121 \h </w:instrText>
+            </w:r>
+            <w:r>
+              <w:rPr>
+                <w:noProof/>
+                <w:webHidden/>
+              </w:rPr>
+            </w:r>
+            <w:r>
+              <w:rPr>
+                <w:noProof/>
+                <w:webHidden/>
+              </w:rPr>
+              <w:fldChar w:fldCharType="separate"/>
+            </w:r>
+            <w:r>
+              <w:rPr>
+                <w:noProof/>
+                <w:webHidden/>
+              </w:rPr>
+              <w:t>6</w:t>
             </w:r>
             <w:r>
               <w:rPr>
@@ -814,7 +1094,7 @@
       <w:pPr>
         <w:pStyle w:val="1"/>
       </w:pPr>
-      <w:bookmarkStart w:id="0" w:name="_Toc223035360"/>
+      <w:bookmarkStart w:id="0" w:name="_Toc226478108"/>
       <w:r>
         <w:lastRenderedPageBreak/>
         <w:t>Общие сведения</w:t>
@@ -822,7 +1102,7 @@
       <w:bookmarkEnd w:id="0"/>
     </w:p>
     <w:p>
-      <w:bookmarkStart w:id="1" w:name="_Toc223035361"/>
+      <w:bookmarkStart w:id="1" w:name="_Toc226478109"/>
       <w:r>
         <w:rPr>
           <w:rStyle w:val="20"/>
@@ -852,7 +1132,7 @@
       <w:pPr>
         <w:pStyle w:val="2"/>
       </w:pPr>
-      <w:bookmarkStart w:id="2" w:name="_Toc223035362"/>
+      <w:bookmarkStart w:id="2" w:name="_Toc226478110"/>
       <w:r>
         <w:t>Тематика</w:t>
       </w:r>
@@ -870,7 +1150,7 @@
           <w:lang w:val="en-US"/>
         </w:rPr>
       </w:pPr>
-      <w:bookmarkStart w:id="3" w:name="_Toc223035363"/>
+      <w:bookmarkStart w:id="3" w:name="_Toc226478111"/>
       <w:r>
         <w:t>Название</w:t>
       </w:r>
@@ -926,7 +1206,7 @@
       </w:r>
     </w:p>
     <w:p>
-      <w:bookmarkStart w:id="4" w:name="_Toc223035364"/>
+      <w:bookmarkStart w:id="4" w:name="_Toc226478112"/>
       <w:r>
         <w:rPr>
           <w:rStyle w:val="20"/>
@@ -947,7 +1227,7 @@
       </w:r>
     </w:p>
     <w:p>
-      <w:bookmarkStart w:id="5" w:name="_Toc223035365"/>
+      <w:bookmarkStart w:id="5" w:name="_Toc226478113"/>
       <w:r>
         <w:rPr>
           <w:rStyle w:val="20"/>
@@ -983,7 +1263,7 @@
       <w:pPr>
         <w:pStyle w:val="2"/>
       </w:pPr>
-      <w:bookmarkStart w:id="6" w:name="_Toc223035366"/>
+      <w:bookmarkStart w:id="6" w:name="_Toc226478114"/>
       <w:r>
         <w:t>Общий сюжет</w:t>
       </w:r>
@@ -1001,7 +1281,7 @@
       <w:pPr>
         <w:pStyle w:val="2"/>
       </w:pPr>
-      <w:bookmarkStart w:id="7" w:name="_Toc223035367"/>
+      <w:bookmarkStart w:id="7" w:name="_Toc226478115"/>
       <w:r>
         <w:t>Геймплей</w:t>
       </w:r>
@@ -1043,7 +1323,7 @@
       <w:pPr>
         <w:pStyle w:val="1"/>
       </w:pPr>
-      <w:bookmarkStart w:id="8" w:name="_Toc223035368"/>
+      <w:bookmarkStart w:id="8" w:name="_Toc226478116"/>
       <w:r>
         <w:t>Функциональные требования:</w:t>
       </w:r>
@@ -1158,7 +1438,7 @@
       <w:pPr>
         <w:pStyle w:val="1"/>
       </w:pPr>
-      <w:bookmarkStart w:id="9" w:name="_Toc223035369"/>
+      <w:bookmarkStart w:id="9" w:name="_Toc226478117"/>
       <w:r>
         <w:t>Нефункциональные требования</w:t>
       </w:r>
@@ -1194,17 +1474,23 @@
       <w:pPr>
         <w:pStyle w:val="1"/>
       </w:pPr>
+      <w:bookmarkStart w:id="10" w:name="_Toc226478118"/>
       <w:r>
         <w:t>Контент</w:t>
       </w:r>
+      <w:bookmarkEnd w:id="10"/>
     </w:p>
     <w:p>
       <w:pPr>
         <w:pStyle w:val="2"/>
       </w:pPr>
+      <w:bookmarkStart w:id="11" w:name="_Toc226478119"/>
+      <w:bookmarkStart w:id="12" w:name="_GoBack"/>
+      <w:bookmarkEnd w:id="12"/>
       <w:r>
         <w:t>Оружие</w:t>
       </w:r>
+      <w:bookmarkEnd w:id="11"/>
     </w:p>
     <w:p>
       <w:r>
@@ -1291,10 +1577,7 @@
         <w:t xml:space="preserve"> </w:t>
       </w:r>
       <w:r>
-        <w:t>–</w:t>
-      </w:r>
-      <w:r>
-        <w:t xml:space="preserve"> </w:t>
+        <w:t xml:space="preserve">– </w:t>
       </w:r>
       <w:r>
         <w:rPr>
@@ -1550,10 +1833,7 @@
         <w:t>Missile</w:t>
       </w:r>
       <w:r>
-        <w:t xml:space="preserve"> –</w:t>
-      </w:r>
-      <w:r>
-        <w:t xml:space="preserve"> редко стреляет одной бомбой с огромным уроном, и оставляющей за собой ядовитую для всех зону</w:t>
+        <w:t xml:space="preserve"> – редко стреляет одной бомбой с огромным уроном, и оставляющей за собой ядовитую для всех зону</w:t>
       </w:r>
     </w:p>
     <w:p>
@@ -1982,9 +2262,11 @@
       <w:pPr>
         <w:pStyle w:val="2"/>
       </w:pPr>
+      <w:bookmarkStart w:id="13" w:name="_Toc226478120"/>
       <w:r>
         <w:t>Модули</w:t>
       </w:r>
+      <w:bookmarkEnd w:id="13"/>
     </w:p>
     <w:p>
       <w:r>
@@ -2008,17 +2290,17 @@
       <w:r>
         <w:t>позволяет телепортироватся на некоторое расстояние. Апгрейды добавляют время неуязвимости и восстановление щитов после ТП</w:t>
       </w:r>
-      <w:bookmarkStart w:id="10" w:name="_GoBack"/>
-      <w:bookmarkEnd w:id="10"/>
     </w:p>
     <w:p/>
     <w:p>
       <w:pPr>
         <w:pStyle w:val="2"/>
       </w:pPr>
+      <w:bookmarkStart w:id="14" w:name="_Toc226478121"/>
       <w:r>
         <w:t>Враги</w:t>
       </w:r>
+      <w:bookmarkEnd w:id="14"/>
     </w:p>
     <w:p>
       <w:r>
@@ -2886,7 +3168,7 @@
 </file>
 
 <file path=customXml/itemProps1.xml><?xml version="1.0" encoding="utf-8"?>
-<ds:datastoreItem xmlns:ds="http://schemas.openxmlformats.org/officeDocument/2006/customXml" ds:itemID="{AFF74DCE-91E8-46CF-910B-1755EF38EA7E}">
+<ds:datastoreItem xmlns:ds="http://schemas.openxmlformats.org/officeDocument/2006/customXml" ds:itemID="{F634D1B8-4309-42EF-BA43-0DB517F9A5A7}">
   <ds:schemaRefs>
     <ds:schemaRef ds:uri="http://schemas.openxmlformats.org/officeDocument/2006/bibliography"/>
   </ds:schemaRefs>

</xml_diff>

<commit_message>
add Reaper Player ship
</commit_message>
<xml_diff>
--- a/Assets/Docs.docx
+++ b/Assets/Docs.docx
@@ -908,23 +908,7 @@
                 <w:rFonts w:cstheme="majorHAnsi"/>
                 <w:noProof/>
               </w:rPr>
-              <w:t>Корабл</w:t>
-            </w:r>
-            <w:r>
-              <w:rPr>
-                <w:rStyle w:val="a4"/>
-                <w:rFonts w:cstheme="majorHAnsi"/>
-                <w:noProof/>
-              </w:rPr>
-              <w:t>и</w:t>
-            </w:r>
-            <w:r>
-              <w:rPr>
-                <w:rStyle w:val="a4"/>
-                <w:rFonts w:cstheme="majorHAnsi"/>
-                <w:noProof/>
-              </w:rPr>
-              <w:t xml:space="preserve"> игрока</w:t>
+              <w:t>Корабли игрока</w:t>
             </w:r>
             <w:r>
               <w:rPr>
@@ -1962,7 +1946,6 @@
       <w:pPr>
         <w:rPr>
           <w:rFonts w:asciiTheme="majorHAnsi" w:hAnsiTheme="majorHAnsi" w:cstheme="majorHAnsi"/>
-          <w:lang w:val="pl-PL"/>
         </w:rPr>
       </w:pPr>
       <w:r>
@@ -2134,11 +2117,6 @@
       </w:r>
     </w:p>
     <w:p>
-      <w:pPr>
-        <w:rPr>
-          <w:lang w:val="pl-PL"/>
-        </w:rPr>
-      </w:pPr>
       <w:r>
         <w:t>3</w:t>
       </w:r>
@@ -2150,91 +2128,1000 @@
           <w:lang w:val="pl-PL"/>
         </w:rPr>
         <w:t>Yamato</w:t>
+      </w:r>
+    </w:p>
+    <w:p>
+      <w:pPr>
+        <w:rPr>
+          <w:lang w:val="uk-UA"/>
+        </w:rPr>
+      </w:pPr>
+      <w:r>
+        <w:rPr>
+          <w:lang w:val="uk-UA"/>
+        </w:rPr>
+        <w:t>Подавляющая огневая мощь. Средняя скорость, большой запас ХП, дополнительная турель.</w:t>
+      </w:r>
+    </w:p>
+    <w:p>
+      <w:r>
+        <w:t xml:space="preserve">Пассивная способность: </w:t>
+      </w:r>
+      <w:r>
+        <w:rPr>
+          <w:lang w:val="pl-PL"/>
+        </w:rPr>
+        <w:t>Flagship</w:t>
+      </w:r>
+      <w:r>
+        <w:t xml:space="preserve"> </w:t>
+      </w:r>
+      <w:r>
+        <w:rPr>
+          <w:lang w:val="pl-PL"/>
+        </w:rPr>
+        <w:t>turrets</w:t>
+      </w:r>
+      <w:r>
+        <w:t xml:space="preserve"> – </w:t>
+      </w:r>
+      <w:r>
+        <w:t>первое оружие на корабле дублируеться.</w:t>
+      </w:r>
+    </w:p>
+    <w:p>
+      <w:r>
+        <w:t>4</w:t>
+      </w:r>
+      <w:r>
+        <w:t xml:space="preserve">. </w:t>
+      </w:r>
+      <w:r>
+        <w:rPr>
+          <w:lang w:val="pl-PL"/>
+        </w:rPr>
+        <w:t>Thunder</w:t>
+      </w:r>
+    </w:p>
+    <w:p>
+      <w:r>
+        <w:rPr>
+          <w:lang w:val="uk-UA"/>
+        </w:rPr>
+        <w:t>Лёгкий, в</w:t>
+      </w:r>
+      <w:r>
+        <w:t>ысокотехнологичный корабль. Повышенная скорость</w:t>
+      </w:r>
+      <w:r>
+        <w:t>, повышенный урон электро-оружий, усиленные щиты</w:t>
+      </w:r>
+    </w:p>
+    <w:p>
+      <w:r>
+        <w:t xml:space="preserve">Активная способность: </w:t>
+      </w:r>
+      <w:r>
+        <w:rPr>
+          <w:lang w:val="pl-PL"/>
+        </w:rPr>
+        <w:t>EMP</w:t>
+      </w:r>
+      <w:r>
+        <w:t xml:space="preserve"> – </w:t>
+      </w:r>
+      <w:r>
+        <w:t>временно оглушает врагов в радиусе вокруг себя</w:t>
+      </w:r>
+    </w:p>
+    <w:p>
+      <w:r>
+        <w:rPr>
+          <w:lang w:val="uk-UA"/>
+        </w:rPr>
+        <w:t xml:space="preserve">5. </w:t>
+      </w:r>
+      <w:r>
+        <w:rPr>
+          <w:lang w:val="pl-PL"/>
+        </w:rPr>
+        <w:t>Reaper</w:t>
+      </w:r>
+    </w:p>
+    <w:p>
+      <w:r>
+        <w:t>Скрытный корабль – ассасин. Повышенные скорость и урон, меньше ХП</w:t>
+      </w:r>
+      <w:r>
+        <w:t>, упор на активную способность</w:t>
       </w:r>
       <w:bookmarkStart w:id="12" w:name="_GoBack"/>
       <w:bookmarkEnd w:id="12"/>
-    </w:p>
-    <w:p>
-      <w:pPr>
-        <w:rPr>
-          <w:lang w:val="uk-UA"/>
-        </w:rPr>
-      </w:pPr>
-      <w:r>
-        <w:rPr>
-          <w:lang w:val="uk-UA"/>
-        </w:rPr>
-        <w:t>Подавляющая огневая мощь. Средняя скорость, большой запас ХП, дополнительная турель.</w:t>
-      </w:r>
-    </w:p>
-    <w:p>
-      <w:r>
-        <w:t xml:space="preserve">Пассивная способность: </w:t>
-      </w:r>
-      <w:r>
-        <w:rPr>
-          <w:lang w:val="pl-PL"/>
-        </w:rPr>
-        <w:t xml:space="preserve">Flagship turrets – </w:t>
-      </w:r>
-      <w:r>
-        <w:t>первое оружие на корабле дублируеться.</w:t>
-      </w:r>
-    </w:p>
-    <w:p>
-      <w:r>
-        <w:t>4</w:t>
-      </w:r>
-      <w:r>
-        <w:t xml:space="preserve">. </w:t>
-      </w:r>
-      <w:r>
-        <w:rPr>
+      <w:r>
+        <w:br/>
+        <w:t xml:space="preserve">Активная способность: </w:t>
+      </w:r>
+      <w:r>
+        <w:rPr>
+          <w:lang w:val="pl-PL"/>
+        </w:rPr>
+        <w:t>One</w:t>
+      </w:r>
+      <w:r>
+        <w:t xml:space="preserve"> </w:t>
+      </w:r>
+      <w:r>
+        <w:rPr>
+          <w:lang w:val="pl-PL"/>
+        </w:rPr>
+        <w:t>with</w:t>
+      </w:r>
+      <w:r>
+        <w:t xml:space="preserve"> </w:t>
+      </w:r>
+      <w:r>
+        <w:rPr>
+          <w:lang w:val="pl-PL"/>
+        </w:rPr>
+        <w:t>the</w:t>
+      </w:r>
+      <w:r>
+        <w:t xml:space="preserve"> </w:t>
+      </w:r>
+      <w:r>
+        <w:rPr>
+          <w:lang w:val="pl-PL"/>
+        </w:rPr>
+        <w:t>void</w:t>
+      </w:r>
+      <w:r>
+        <w:t xml:space="preserve"> </w:t>
+      </w:r>
+      <w:r>
+        <w:t>–</w:t>
+      </w:r>
+      <w:r>
+        <w:t xml:space="preserve"> </w:t>
+      </w:r>
+      <w:r>
+        <w:t>временно становиться невидимым и неуязвимым и быстро восстанавливает ХП и щиты, после получает временное повышение урона и скорострельности.</w:t>
+      </w:r>
+    </w:p>
+    <w:p>
+      <w:pPr>
+        <w:rPr>
+          <w:rFonts w:asciiTheme="majorHAnsi" w:hAnsiTheme="majorHAnsi" w:cstheme="majorHAnsi"/>
+        </w:rPr>
+      </w:pPr>
+    </w:p>
+    <w:p>
+      <w:pPr>
+        <w:pStyle w:val="2"/>
+        <w:rPr>
+          <w:rFonts w:cstheme="majorHAnsi"/>
+        </w:rPr>
+      </w:pPr>
+      <w:bookmarkStart w:id="13" w:name="_Toc232347209"/>
+      <w:r>
+        <w:rPr>
+          <w:rFonts w:cstheme="majorHAnsi"/>
+        </w:rPr>
+        <w:t>Оружие</w:t>
+      </w:r>
+      <w:bookmarkEnd w:id="13"/>
+    </w:p>
+    <w:p>
+      <w:pPr>
+        <w:rPr>
+          <w:rFonts w:asciiTheme="majorHAnsi" w:hAnsiTheme="majorHAnsi" w:cstheme="majorHAnsi"/>
+        </w:rPr>
+      </w:pPr>
+      <w:r>
+        <w:rPr>
+          <w:rFonts w:asciiTheme="majorHAnsi" w:hAnsiTheme="majorHAnsi" w:cstheme="majorHAnsi"/>
+          <w:highlight w:val="yellow"/>
+          <w:lang w:val="pl-PL"/>
+        </w:rPr>
+        <w:t>Cannon</w:t>
+      </w:r>
+      <w:r>
+        <w:rPr>
+          <w:rFonts w:asciiTheme="majorHAnsi" w:hAnsiTheme="majorHAnsi" w:cstheme="majorHAnsi"/>
+          <w:highlight w:val="yellow"/>
+        </w:rPr>
+        <w:t xml:space="preserve"> – простая пушка, стреляет в ближайшего врага</w:t>
+      </w:r>
+    </w:p>
+    <w:p>
+      <w:pPr>
+        <w:rPr>
+          <w:rFonts w:asciiTheme="majorHAnsi" w:hAnsiTheme="majorHAnsi" w:cstheme="majorHAnsi"/>
+        </w:rPr>
+      </w:pPr>
+      <w:r>
+        <w:rPr>
+          <w:rFonts w:asciiTheme="majorHAnsi" w:hAnsiTheme="majorHAnsi" w:cstheme="majorHAnsi"/>
+          <w:lang w:val="pl-PL"/>
+        </w:rPr>
+        <w:t>Minigun</w:t>
+      </w:r>
+      <w:r>
+        <w:rPr>
+          <w:rFonts w:asciiTheme="majorHAnsi" w:hAnsiTheme="majorHAnsi" w:cstheme="majorHAnsi"/>
+        </w:rPr>
+        <w:t xml:space="preserve"> - апгрейд из фулл прокачанного </w:t>
+      </w:r>
+      <w:r>
+        <w:rPr>
+          <w:rFonts w:asciiTheme="majorHAnsi" w:hAnsiTheme="majorHAnsi" w:cstheme="majorHAnsi"/>
+          <w:lang w:val="pl-PL"/>
+        </w:rPr>
+        <w:t>Cannon</w:t>
+      </w:r>
+      <w:r>
+        <w:rPr>
+          <w:rFonts w:asciiTheme="majorHAnsi" w:hAnsiTheme="majorHAnsi" w:cstheme="majorHAnsi"/>
+        </w:rPr>
+        <w:t xml:space="preserve"> – стреляет быстро в ближайшего врага, меньший радус обнаружения, быстрые пули</w:t>
+      </w:r>
+    </w:p>
+    <w:p>
+      <w:pPr>
+        <w:rPr>
+          <w:rFonts w:asciiTheme="majorHAnsi" w:hAnsiTheme="majorHAnsi" w:cstheme="majorHAnsi"/>
+        </w:rPr>
+      </w:pPr>
+      <w:r>
+        <w:rPr>
+          <w:rFonts w:asciiTheme="majorHAnsi" w:hAnsiTheme="majorHAnsi" w:cstheme="majorHAnsi"/>
+          <w:lang w:val="pl-PL"/>
+        </w:rPr>
+        <w:t>Vacuum</w:t>
+      </w:r>
+      <w:r>
+        <w:rPr>
+          <w:rFonts w:asciiTheme="majorHAnsi" w:hAnsiTheme="majorHAnsi" w:cstheme="majorHAnsi"/>
+        </w:rPr>
+        <w:t xml:space="preserve"> </w:t>
+      </w:r>
+      <w:r>
+        <w:rPr>
+          <w:rFonts w:asciiTheme="majorHAnsi" w:hAnsiTheme="majorHAnsi" w:cstheme="majorHAnsi"/>
+          <w:lang w:val="pl-PL"/>
+        </w:rPr>
+        <w:t>Cannon</w:t>
+      </w:r>
+      <w:r>
+        <w:rPr>
+          <w:rFonts w:asciiTheme="majorHAnsi" w:hAnsiTheme="majorHAnsi" w:cstheme="majorHAnsi"/>
+        </w:rPr>
+        <w:t xml:space="preserve"> - апгрейд из фулл прокачанного </w:t>
+      </w:r>
+      <w:r>
+        <w:rPr>
+          <w:rFonts w:asciiTheme="majorHAnsi" w:hAnsiTheme="majorHAnsi" w:cstheme="majorHAnsi"/>
+          <w:lang w:val="pl-PL"/>
+        </w:rPr>
+        <w:t>Cannon</w:t>
+      </w:r>
+      <w:r>
+        <w:rPr>
+          <w:rFonts w:asciiTheme="majorHAnsi" w:hAnsiTheme="majorHAnsi" w:cstheme="majorHAnsi"/>
+        </w:rPr>
+        <w:t xml:space="preserve"> – </w:t>
+      </w:r>
+      <w:r>
+        <w:rPr>
+          <w:rFonts w:asciiTheme="majorHAnsi" w:hAnsiTheme="majorHAnsi" w:cstheme="majorHAnsi"/>
+          <w:lang w:val="pl-PL"/>
+        </w:rPr>
+        <w:t>AoE</w:t>
+      </w:r>
+      <w:r>
+        <w:rPr>
+          <w:rFonts w:asciiTheme="majorHAnsi" w:hAnsiTheme="majorHAnsi" w:cstheme="majorHAnsi"/>
+        </w:rPr>
+        <w:t xml:space="preserve"> отталкивание противников </w:t>
+      </w:r>
+    </w:p>
+    <w:p>
+      <w:pPr>
+        <w:rPr>
+          <w:rFonts w:asciiTheme="majorHAnsi" w:hAnsiTheme="majorHAnsi" w:cstheme="majorHAnsi"/>
+        </w:rPr>
+      </w:pPr>
+      <w:r>
+        <w:rPr>
+          <w:rFonts w:asciiTheme="majorHAnsi" w:hAnsiTheme="majorHAnsi" w:cstheme="majorHAnsi"/>
+          <w:highlight w:val="yellow"/>
+          <w:lang w:val="pl-PL"/>
+        </w:rPr>
+        <w:t>Shotgun</w:t>
+      </w:r>
+      <w:r>
+        <w:rPr>
+          <w:rFonts w:asciiTheme="majorHAnsi" w:hAnsiTheme="majorHAnsi" w:cstheme="majorHAnsi"/>
+          <w:highlight w:val="yellow"/>
+        </w:rPr>
+        <w:t xml:space="preserve"> – дробовик, стреляет дробью в ближайшего врага</w:t>
+      </w:r>
+    </w:p>
+    <w:p>
+      <w:pPr>
+        <w:rPr>
+          <w:rFonts w:asciiTheme="majorHAnsi" w:hAnsiTheme="majorHAnsi" w:cstheme="majorHAnsi"/>
+        </w:rPr>
+      </w:pPr>
+      <w:r>
+        <w:rPr>
+          <w:rFonts w:asciiTheme="majorHAnsi" w:hAnsiTheme="majorHAnsi" w:cstheme="majorHAnsi"/>
+          <w:lang w:val="pl-PL"/>
+        </w:rPr>
+        <w:t>Eradicator</w:t>
+      </w:r>
+      <w:r>
+        <w:rPr>
+          <w:rFonts w:asciiTheme="majorHAnsi" w:hAnsiTheme="majorHAnsi" w:cstheme="majorHAnsi"/>
+        </w:rPr>
+        <w:t xml:space="preserve"> – апгрейд из фулл прокачанного </w:t>
+      </w:r>
+      <w:r>
+        <w:rPr>
+          <w:rFonts w:asciiTheme="majorHAnsi" w:hAnsiTheme="majorHAnsi" w:cstheme="majorHAnsi"/>
+          <w:lang w:val="pl-PL"/>
+        </w:rPr>
+        <w:t>Shotgun</w:t>
+      </w:r>
+      <w:r>
+        <w:rPr>
+          <w:rFonts w:asciiTheme="majorHAnsi" w:hAnsiTheme="majorHAnsi" w:cstheme="majorHAnsi"/>
+        </w:rPr>
+        <w:t xml:space="preserve"> – </w:t>
+      </w:r>
+      <w:r>
+        <w:rPr>
+          <w:rFonts w:asciiTheme="majorHAnsi" w:hAnsiTheme="majorHAnsi" w:cstheme="majorHAnsi"/>
+        </w:rPr>
+        <w:t xml:space="preserve">скорострельный дробовик - </w:t>
+      </w:r>
+      <w:r>
+        <w:rPr>
+          <w:rFonts w:asciiTheme="majorHAnsi" w:hAnsiTheme="majorHAnsi" w:cstheme="majorHAnsi"/>
+        </w:rPr>
+        <w:t xml:space="preserve">то же по сути что и </w:t>
+      </w:r>
+      <w:r>
+        <w:rPr>
+          <w:rFonts w:asciiTheme="majorHAnsi" w:hAnsiTheme="majorHAnsi" w:cstheme="majorHAnsi"/>
+          <w:lang w:val="pl-PL"/>
+        </w:rPr>
+        <w:t>Minigun</w:t>
+      </w:r>
+    </w:p>
+    <w:p>
+      <w:pPr>
+        <w:rPr>
+          <w:rFonts w:asciiTheme="majorHAnsi" w:hAnsiTheme="majorHAnsi" w:cstheme="majorHAnsi"/>
+        </w:rPr>
+      </w:pPr>
+      <w:r>
+        <w:rPr>
+          <w:rFonts w:asciiTheme="majorHAnsi" w:hAnsiTheme="majorHAnsi" w:cstheme="majorHAnsi"/>
+          <w:lang w:val="pl-PL"/>
+        </w:rPr>
+        <w:t>Octuple</w:t>
+      </w:r>
+      <w:r>
+        <w:rPr>
+          <w:rFonts w:asciiTheme="majorHAnsi" w:hAnsiTheme="majorHAnsi" w:cstheme="majorHAnsi"/>
+        </w:rPr>
+        <w:t xml:space="preserve"> </w:t>
+      </w:r>
+      <w:r>
+        <w:rPr>
+          <w:rFonts w:asciiTheme="majorHAnsi" w:hAnsiTheme="majorHAnsi" w:cstheme="majorHAnsi"/>
+          <w:lang w:val="pl-PL"/>
+        </w:rPr>
+        <w:t>Shotgun</w:t>
+      </w:r>
+      <w:r>
+        <w:rPr>
+          <w:rFonts w:asciiTheme="majorHAnsi" w:hAnsiTheme="majorHAnsi" w:cstheme="majorHAnsi"/>
+        </w:rPr>
+        <w:t xml:space="preserve"> – апгрейд из фулл прокачанного </w:t>
+      </w:r>
+      <w:r>
+        <w:rPr>
+          <w:rFonts w:asciiTheme="majorHAnsi" w:hAnsiTheme="majorHAnsi" w:cstheme="majorHAnsi"/>
+          <w:lang w:val="pl-PL"/>
+        </w:rPr>
+        <w:t>Shotgun</w:t>
+      </w:r>
+      <w:r>
+        <w:rPr>
+          <w:rFonts w:asciiTheme="majorHAnsi" w:hAnsiTheme="majorHAnsi" w:cstheme="majorHAnsi"/>
+        </w:rPr>
+        <w:t xml:space="preserve"> – восемь более слабых дробовиков, направленных во все стороны</w:t>
+      </w:r>
+    </w:p>
+    <w:p>
+      <w:pPr>
+        <w:rPr>
+          <w:rFonts w:asciiTheme="majorHAnsi" w:hAnsiTheme="majorHAnsi" w:cstheme="majorHAnsi"/>
+        </w:rPr>
+      </w:pPr>
+      <w:r>
+        <w:rPr>
+          <w:rFonts w:asciiTheme="majorHAnsi" w:hAnsiTheme="majorHAnsi" w:cstheme="majorHAnsi"/>
+          <w:highlight w:val="yellow"/>
+          <w:lang w:val="pl-PL"/>
+        </w:rPr>
+        <w:lastRenderedPageBreak/>
+        <w:t>Missile</w:t>
+      </w:r>
+      <w:r>
+        <w:rPr>
+          <w:rFonts w:asciiTheme="majorHAnsi" w:hAnsiTheme="majorHAnsi" w:cstheme="majorHAnsi"/>
+          <w:highlight w:val="yellow"/>
+        </w:rPr>
+        <w:t xml:space="preserve"> – стреляет ракетой прямо</w:t>
+      </w:r>
+      <w:r>
+        <w:rPr>
+          <w:rFonts w:asciiTheme="majorHAnsi" w:hAnsiTheme="majorHAnsi" w:cstheme="majorHAnsi"/>
+          <w:highlight w:val="yellow"/>
+        </w:rPr>
+        <w:t>. Ракеты можно уничтожить пулей. Ракеты взрываются при попадании или спустя время. Апгрейд добавляет самонаводку.</w:t>
+      </w:r>
+    </w:p>
+    <w:p>
+      <w:pPr>
+        <w:rPr>
+          <w:rFonts w:asciiTheme="majorHAnsi" w:hAnsiTheme="majorHAnsi" w:cstheme="majorHAnsi"/>
+        </w:rPr>
+      </w:pPr>
+      <w:r>
+        <w:rPr>
+          <w:rFonts w:asciiTheme="majorHAnsi" w:hAnsiTheme="majorHAnsi" w:cstheme="majorHAnsi"/>
+          <w:lang w:val="pl-PL"/>
+        </w:rPr>
+        <w:t>Rocket</w:t>
+      </w:r>
+      <w:r>
+        <w:rPr>
+          <w:rFonts w:asciiTheme="majorHAnsi" w:hAnsiTheme="majorHAnsi" w:cstheme="majorHAnsi"/>
+        </w:rPr>
+        <w:t xml:space="preserve"> </w:t>
+      </w:r>
+      <w:r>
+        <w:rPr>
+          <w:rFonts w:asciiTheme="majorHAnsi" w:hAnsiTheme="majorHAnsi" w:cstheme="majorHAnsi"/>
+          <w:lang w:val="pl-PL"/>
+        </w:rPr>
+        <w:t>Swarm</w:t>
+      </w:r>
+      <w:r>
+        <w:rPr>
+          <w:rFonts w:asciiTheme="majorHAnsi" w:hAnsiTheme="majorHAnsi" w:cstheme="majorHAnsi"/>
+        </w:rPr>
+        <w:t xml:space="preserve"> – апгрейд из фулл прокачанного </w:t>
+      </w:r>
+      <w:r>
+        <w:rPr>
+          <w:rFonts w:asciiTheme="majorHAnsi" w:hAnsiTheme="majorHAnsi" w:cstheme="majorHAnsi"/>
+          <w:lang w:val="pl-PL"/>
+        </w:rPr>
+        <w:t>Missile</w:t>
+      </w:r>
+      <w:r>
+        <w:rPr>
+          <w:rFonts w:asciiTheme="majorHAnsi" w:hAnsiTheme="majorHAnsi" w:cstheme="majorHAnsi"/>
+        </w:rPr>
+        <w:t xml:space="preserve"> – стреляет множеством маленьких и быстрых ракет</w:t>
+      </w:r>
+    </w:p>
+    <w:p>
+      <w:pPr>
+        <w:rPr>
+          <w:rFonts w:asciiTheme="majorHAnsi" w:hAnsiTheme="majorHAnsi" w:cstheme="majorHAnsi"/>
+        </w:rPr>
+      </w:pPr>
+      <w:r>
+        <w:rPr>
+          <w:rFonts w:asciiTheme="majorHAnsi" w:hAnsiTheme="majorHAnsi" w:cstheme="majorHAnsi"/>
+          <w:lang w:val="pl-PL"/>
+        </w:rPr>
+        <w:t>Nuke</w:t>
+      </w:r>
+      <w:r>
+        <w:rPr>
+          <w:rFonts w:asciiTheme="majorHAnsi" w:hAnsiTheme="majorHAnsi" w:cstheme="majorHAnsi"/>
+        </w:rPr>
+        <w:t xml:space="preserve"> - апгрейд из фулл прокачанного </w:t>
+      </w:r>
+      <w:r>
+        <w:rPr>
+          <w:rFonts w:asciiTheme="majorHAnsi" w:hAnsiTheme="majorHAnsi" w:cstheme="majorHAnsi"/>
+          <w:lang w:val="pl-PL"/>
+        </w:rPr>
+        <w:t>Missile</w:t>
+      </w:r>
+      <w:r>
+        <w:rPr>
+          <w:rFonts w:asciiTheme="majorHAnsi" w:hAnsiTheme="majorHAnsi" w:cstheme="majorHAnsi"/>
+        </w:rPr>
+        <w:t xml:space="preserve"> – редко стреляет одной бомбой с огромным уроном, и оставляющей за собой ядовитую для всех зону</w:t>
+      </w:r>
+    </w:p>
+    <w:p>
+      <w:pPr>
+        <w:rPr>
+          <w:rFonts w:asciiTheme="majorHAnsi" w:hAnsiTheme="majorHAnsi" w:cstheme="majorHAnsi"/>
+        </w:rPr>
+      </w:pPr>
+      <w:r>
+        <w:rPr>
+          <w:rFonts w:asciiTheme="majorHAnsi" w:hAnsiTheme="majorHAnsi" w:cstheme="majorHAnsi"/>
+          <w:highlight w:val="yellow"/>
+          <w:lang w:val="pl-PL"/>
+        </w:rPr>
+        <w:t>Railgun</w:t>
+      </w:r>
+      <w:r>
+        <w:rPr>
+          <w:rFonts w:asciiTheme="majorHAnsi" w:hAnsiTheme="majorHAnsi" w:cstheme="majorHAnsi"/>
+          <w:highlight w:val="yellow"/>
+        </w:rPr>
+        <w:t xml:space="preserve"> – редко стреляет очень быстрым снарядом. Наводится в 15-45 градусах напротив себя.</w:t>
+      </w:r>
+      <w:r>
+        <w:rPr>
+          <w:rFonts w:asciiTheme="majorHAnsi" w:hAnsiTheme="majorHAnsi" w:cstheme="majorHAnsi"/>
+          <w:highlight w:val="yellow"/>
+        </w:rPr>
+        <w:t xml:space="preserve"> Апгрейды добавляют пробивание нескольких целей.</w:t>
+      </w:r>
+    </w:p>
+    <w:p>
+      <w:pPr>
+        <w:rPr>
+          <w:rFonts w:asciiTheme="majorHAnsi" w:hAnsiTheme="majorHAnsi" w:cstheme="majorHAnsi"/>
+        </w:rPr>
+      </w:pPr>
+      <w:r>
+        <w:rPr>
+          <w:rFonts w:asciiTheme="majorHAnsi" w:hAnsiTheme="majorHAnsi" w:cstheme="majorHAnsi"/>
+          <w:lang w:val="pl-PL"/>
+        </w:rPr>
+        <w:t>Particle</w:t>
+      </w:r>
+      <w:r>
+        <w:rPr>
+          <w:rFonts w:asciiTheme="majorHAnsi" w:hAnsiTheme="majorHAnsi" w:cstheme="majorHAnsi"/>
+        </w:rPr>
+        <w:t xml:space="preserve"> </w:t>
+      </w:r>
+      <w:r>
+        <w:rPr>
+          <w:rFonts w:asciiTheme="majorHAnsi" w:hAnsiTheme="majorHAnsi" w:cstheme="majorHAnsi"/>
+          <w:lang w:val="pl-PL"/>
+        </w:rPr>
+        <w:t>Accelerator</w:t>
+      </w:r>
+      <w:r>
+        <w:rPr>
+          <w:rFonts w:asciiTheme="majorHAnsi" w:hAnsiTheme="majorHAnsi" w:cstheme="majorHAnsi"/>
+        </w:rPr>
+        <w:t xml:space="preserve"> - апгрейд из фулл прокачанного </w:t>
+      </w:r>
+      <w:r>
+        <w:rPr>
+          <w:rFonts w:asciiTheme="majorHAnsi" w:hAnsiTheme="majorHAnsi" w:cstheme="majorHAnsi"/>
+          <w:lang w:val="pl-PL"/>
+        </w:rPr>
+        <w:t>Railgun</w:t>
+      </w:r>
+      <w:r>
+        <w:rPr>
+          <w:rFonts w:asciiTheme="majorHAnsi" w:hAnsiTheme="majorHAnsi" w:cstheme="majorHAnsi"/>
+        </w:rPr>
+        <w:t xml:space="preserve"> – бесконечное пробивание</w:t>
+      </w:r>
+    </w:p>
+    <w:p>
+      <w:pPr>
+        <w:rPr>
+          <w:rFonts w:asciiTheme="majorHAnsi" w:hAnsiTheme="majorHAnsi" w:cstheme="majorHAnsi"/>
+        </w:rPr>
+      </w:pPr>
+      <w:r>
+        <w:rPr>
+          <w:rFonts w:asciiTheme="majorHAnsi" w:hAnsiTheme="majorHAnsi" w:cstheme="majorHAnsi"/>
+          <w:lang w:val="pl-PL"/>
+        </w:rPr>
+        <w:t>Behemoth</w:t>
+      </w:r>
+      <w:r>
+        <w:rPr>
+          <w:rFonts w:asciiTheme="majorHAnsi" w:hAnsiTheme="majorHAnsi" w:cstheme="majorHAnsi"/>
+        </w:rPr>
+        <w:t xml:space="preserve"> </w:t>
+      </w:r>
+      <w:r>
+        <w:rPr>
+          <w:rFonts w:asciiTheme="majorHAnsi" w:hAnsiTheme="majorHAnsi" w:cstheme="majorHAnsi"/>
+          <w:lang w:val="pl-PL"/>
+        </w:rPr>
+        <w:t>Rifle</w:t>
+      </w:r>
+      <w:r>
+        <w:rPr>
+          <w:rFonts w:asciiTheme="majorHAnsi" w:hAnsiTheme="majorHAnsi" w:cstheme="majorHAnsi"/>
+        </w:rPr>
+        <w:t xml:space="preserve"> - апгрейд из фулл прокачанного </w:t>
+      </w:r>
+      <w:r>
+        <w:rPr>
+          <w:rFonts w:asciiTheme="majorHAnsi" w:hAnsiTheme="majorHAnsi" w:cstheme="majorHAnsi"/>
+          <w:lang w:val="pl-PL"/>
+        </w:rPr>
+        <w:t>Railgun</w:t>
+      </w:r>
+      <w:r>
+        <w:rPr>
+          <w:rFonts w:asciiTheme="majorHAnsi" w:hAnsiTheme="majorHAnsi" w:cstheme="majorHAnsi"/>
+        </w:rPr>
+        <w:t xml:space="preserve"> – стреляет только перед собой, дополнительный урон на основании ХП цели</w:t>
+      </w:r>
+    </w:p>
+    <w:p>
+      <w:pPr>
+        <w:rPr>
+          <w:rFonts w:asciiTheme="majorHAnsi" w:hAnsiTheme="majorHAnsi" w:cstheme="majorHAnsi"/>
+        </w:rPr>
+      </w:pPr>
+      <w:r>
+        <w:rPr>
+          <w:rFonts w:asciiTheme="majorHAnsi" w:hAnsiTheme="majorHAnsi" w:cstheme="majorHAnsi"/>
+          <w:highlight w:val="yellow"/>
+          <w:lang w:val="pl-PL"/>
+        </w:rPr>
+        <w:t>Laser</w:t>
+      </w:r>
+      <w:r>
+        <w:rPr>
+          <w:rFonts w:asciiTheme="majorHAnsi" w:hAnsiTheme="majorHAnsi" w:cstheme="majorHAnsi"/>
+          <w:highlight w:val="yellow"/>
+        </w:rPr>
+        <w:t xml:space="preserve"> – редко стреляет лучём вперёд, луч остаётся некоторое время и наносит дополнительный урон целям внутри него.</w:t>
+      </w:r>
+    </w:p>
+    <w:p>
+      <w:pPr>
+        <w:rPr>
+          <w:rFonts w:asciiTheme="majorHAnsi" w:hAnsiTheme="majorHAnsi" w:cstheme="majorHAnsi"/>
+        </w:rPr>
+      </w:pPr>
+      <w:r>
+        <w:rPr>
+          <w:rFonts w:asciiTheme="majorHAnsi" w:hAnsiTheme="majorHAnsi" w:cstheme="majorHAnsi"/>
+          <w:lang w:val="pl-PL"/>
+        </w:rPr>
+        <w:t>Prism</w:t>
+      </w:r>
+      <w:r>
+        <w:rPr>
+          <w:rFonts w:asciiTheme="majorHAnsi" w:hAnsiTheme="majorHAnsi" w:cstheme="majorHAnsi"/>
+        </w:rPr>
+        <w:t xml:space="preserve"> - апгрейд из фулл прокачанного </w:t>
+      </w:r>
+      <w:r>
+        <w:rPr>
+          <w:rFonts w:asciiTheme="majorHAnsi" w:hAnsiTheme="majorHAnsi" w:cstheme="majorHAnsi"/>
+          <w:lang w:val="pl-PL"/>
+        </w:rPr>
+        <w:t>Laser</w:t>
+      </w:r>
+      <w:r>
+        <w:rPr>
+          <w:rFonts w:asciiTheme="majorHAnsi" w:hAnsiTheme="majorHAnsi" w:cstheme="majorHAnsi"/>
+        </w:rPr>
+        <w:t>, стреляет 3 раза, быстрее перезарядка и целится в 45 градусов перед собой</w:t>
+      </w:r>
+    </w:p>
+    <w:p>
+      <w:pPr>
+        <w:rPr>
+          <w:rFonts w:asciiTheme="majorHAnsi" w:hAnsiTheme="majorHAnsi" w:cstheme="majorHAnsi"/>
+        </w:rPr>
+      </w:pPr>
+      <w:r>
+        <w:rPr>
+          <w:rFonts w:asciiTheme="majorHAnsi" w:hAnsiTheme="majorHAnsi" w:cstheme="majorHAnsi"/>
+          <w:lang w:val="pl-PL"/>
+        </w:rPr>
+        <w:t>Blue</w:t>
+      </w:r>
+      <w:r>
+        <w:rPr>
+          <w:rFonts w:asciiTheme="majorHAnsi" w:hAnsiTheme="majorHAnsi" w:cstheme="majorHAnsi"/>
+        </w:rPr>
+        <w:t xml:space="preserve"> </w:t>
+      </w:r>
+      <w:r>
+        <w:rPr>
+          <w:rFonts w:asciiTheme="majorHAnsi" w:hAnsiTheme="majorHAnsi" w:cstheme="majorHAnsi"/>
+          <w:lang w:val="pl-PL"/>
+        </w:rPr>
+        <w:t>Laser</w:t>
+      </w:r>
+      <w:r>
+        <w:rPr>
+          <w:rFonts w:asciiTheme="majorHAnsi" w:hAnsiTheme="majorHAnsi" w:cstheme="majorHAnsi"/>
+        </w:rPr>
+        <w:t xml:space="preserve"> - апгрейд из фулл прокачанного </w:t>
+      </w:r>
+      <w:r>
+        <w:rPr>
+          <w:rFonts w:asciiTheme="majorHAnsi" w:hAnsiTheme="majorHAnsi" w:cstheme="majorHAnsi"/>
+          <w:lang w:val="pl-PL"/>
+        </w:rPr>
+        <w:t>Laser</w:t>
+      </w:r>
+      <w:r>
+        <w:rPr>
+          <w:rFonts w:asciiTheme="majorHAnsi" w:hAnsiTheme="majorHAnsi" w:cstheme="majorHAnsi"/>
+        </w:rPr>
+        <w:t>, игнорирует щиты, дополнительный урон на основании текущего уровня щитов</w:t>
+      </w:r>
+      <w:r>
+        <w:rPr>
+          <w:rFonts w:asciiTheme="majorHAnsi" w:hAnsiTheme="majorHAnsi" w:cstheme="majorHAnsi"/>
+        </w:rPr>
+        <w:t xml:space="preserve"> врага</w:t>
+      </w:r>
+    </w:p>
+    <w:p>
+      <w:pPr>
+        <w:rPr>
+          <w:rFonts w:asciiTheme="majorHAnsi" w:hAnsiTheme="majorHAnsi" w:cstheme="majorHAnsi"/>
+        </w:rPr>
+      </w:pPr>
+      <w:r>
+        <w:rPr>
+          <w:rFonts w:asciiTheme="majorHAnsi" w:hAnsiTheme="majorHAnsi" w:cstheme="majorHAnsi"/>
+          <w:highlight w:val="yellow"/>
+          <w:lang w:val="pl-PL"/>
+        </w:rPr>
+        <w:t>Tesla</w:t>
+      </w:r>
+      <w:r>
+        <w:rPr>
+          <w:rFonts w:asciiTheme="majorHAnsi" w:hAnsiTheme="majorHAnsi" w:cstheme="majorHAnsi"/>
+          <w:highlight w:val="yellow"/>
+        </w:rPr>
+        <w:t xml:space="preserve"> – Средняя скорострельность, молния перескакивает между 3/4/5 врагами, увеличенный урон щитам</w:t>
+      </w:r>
+    </w:p>
+    <w:p>
+      <w:pPr>
+        <w:rPr>
+          <w:rFonts w:asciiTheme="majorHAnsi" w:hAnsiTheme="majorHAnsi" w:cstheme="majorHAnsi"/>
+        </w:rPr>
+      </w:pPr>
+      <w:r>
+        <w:rPr>
+          <w:rFonts w:asciiTheme="majorHAnsi" w:hAnsiTheme="majorHAnsi" w:cstheme="majorHAnsi"/>
+          <w:lang w:val="pl-PL"/>
+        </w:rPr>
+        <w:t>Shock</w:t>
+      </w:r>
+      <w:r>
+        <w:rPr>
+          <w:rFonts w:asciiTheme="majorHAnsi" w:hAnsiTheme="majorHAnsi" w:cstheme="majorHAnsi"/>
+        </w:rPr>
+        <w:t xml:space="preserve"> </w:t>
+      </w:r>
+      <w:r>
+        <w:rPr>
+          <w:rFonts w:asciiTheme="majorHAnsi" w:hAnsiTheme="majorHAnsi" w:cstheme="majorHAnsi"/>
+          <w:lang w:val="pl-PL"/>
+        </w:rPr>
+        <w:t>Field</w:t>
+      </w:r>
+      <w:r>
+        <w:rPr>
+          <w:rFonts w:asciiTheme="majorHAnsi" w:hAnsiTheme="majorHAnsi" w:cstheme="majorHAnsi"/>
+        </w:rPr>
+        <w:t xml:space="preserve"> - апгрейд из фулл прокачанного </w:t>
+      </w:r>
+      <w:r>
+        <w:rPr>
+          <w:rFonts w:asciiTheme="majorHAnsi" w:hAnsiTheme="majorHAnsi" w:cstheme="majorHAnsi"/>
+          <w:lang w:val="pl-PL"/>
+        </w:rPr>
+        <w:t>Tesla</w:t>
+      </w:r>
+      <w:r>
+        <w:rPr>
+          <w:rFonts w:asciiTheme="majorHAnsi" w:hAnsiTheme="majorHAnsi" w:cstheme="majorHAnsi"/>
+        </w:rPr>
+        <w:t xml:space="preserve">, редко бьёт и оглушает всё вокруг себя </w:t>
+      </w:r>
+    </w:p>
+    <w:p>
+      <w:pPr>
+        <w:rPr>
+          <w:rFonts w:asciiTheme="majorHAnsi" w:hAnsiTheme="majorHAnsi" w:cstheme="majorHAnsi"/>
+        </w:rPr>
+      </w:pPr>
+      <w:r>
+        <w:rPr>
+          <w:rFonts w:asciiTheme="majorHAnsi" w:hAnsiTheme="majorHAnsi" w:cstheme="majorHAnsi"/>
           <w:lang w:val="pl-PL"/>
         </w:rPr>
         <w:t>Thunder</w:t>
       </w:r>
-    </w:p>
-    <w:p>
-      <w:r>
-        <w:rPr>
-          <w:lang w:val="uk-UA"/>
-        </w:rPr>
-        <w:t>Лёгкий, в</w:t>
-      </w:r>
-      <w:r>
-        <w:t>ысокотехнологичный корабль. Повышенная скорость</w:t>
-      </w:r>
-      <w:r>
-        <w:t>, повышенный урон электро-оружий, усиленные щиты</w:t>
-      </w:r>
-    </w:p>
-    <w:p>
-      <w:r>
-        <w:t>Активная способность</w:t>
-      </w:r>
-      <w:r>
-        <w:t xml:space="preserve">: </w:t>
-      </w:r>
-      <w:r>
-        <w:rPr>
-          <w:lang w:val="pl-PL"/>
-        </w:rPr>
-        <w:t>EMP</w:t>
-      </w:r>
-      <w:r>
-        <w:t xml:space="preserve"> – </w:t>
-      </w:r>
-      <w:r>
-        <w:t>временно оглушает врагов в радиусе вокруг себя</w:t>
-      </w:r>
-    </w:p>
-    <w:p>
-      <w:pPr>
-        <w:rPr>
-          <w:rFonts w:asciiTheme="majorHAnsi" w:hAnsiTheme="majorHAnsi" w:cstheme="majorHAnsi"/>
-        </w:rPr>
-      </w:pPr>
+      <w:r>
+        <w:rPr>
+          <w:rFonts w:asciiTheme="majorHAnsi" w:hAnsiTheme="majorHAnsi" w:cstheme="majorHAnsi"/>
+        </w:rPr>
+        <w:t xml:space="preserve"> </w:t>
+      </w:r>
+      <w:r>
+        <w:rPr>
+          <w:rFonts w:asciiTheme="majorHAnsi" w:hAnsiTheme="majorHAnsi" w:cstheme="majorHAnsi"/>
+          <w:lang w:val="pl-PL"/>
+        </w:rPr>
+        <w:t>spear</w:t>
+      </w:r>
+      <w:r>
+        <w:rPr>
+          <w:rFonts w:asciiTheme="majorHAnsi" w:hAnsiTheme="majorHAnsi" w:cstheme="majorHAnsi"/>
+        </w:rPr>
+        <w:t xml:space="preserve"> - апгрейд из фулл прокачанного </w:t>
+      </w:r>
+      <w:r>
+        <w:rPr>
+          <w:rFonts w:asciiTheme="majorHAnsi" w:hAnsiTheme="majorHAnsi" w:cstheme="majorHAnsi"/>
+          <w:lang w:val="pl-PL"/>
+        </w:rPr>
+        <w:t>Tesla</w:t>
+      </w:r>
+      <w:r>
+        <w:rPr>
+          <w:rFonts w:asciiTheme="majorHAnsi" w:hAnsiTheme="majorHAnsi" w:cstheme="majorHAnsi"/>
+        </w:rPr>
+        <w:t>, выбирает цель с самым большим максимальным уровнем щитов, продолжает бить п</w:t>
+      </w:r>
+      <w:r>
+        <w:rPr>
+          <w:rFonts w:asciiTheme="majorHAnsi" w:hAnsiTheme="majorHAnsi" w:cstheme="majorHAnsi"/>
+        </w:rPr>
+        <w:t>ока не убьёт, постоянно оглушая</w:t>
+      </w:r>
+    </w:p>
+    <w:p>
+      <w:pPr>
+        <w:rPr>
+          <w:rFonts w:asciiTheme="majorHAnsi" w:hAnsiTheme="majorHAnsi" w:cstheme="majorHAnsi"/>
+        </w:rPr>
+      </w:pPr>
+      <w:r>
+        <w:rPr>
+          <w:rFonts w:asciiTheme="majorHAnsi" w:hAnsiTheme="majorHAnsi" w:cstheme="majorHAnsi"/>
+          <w:highlight w:val="yellow"/>
+          <w:lang w:val="pl-PL"/>
+        </w:rPr>
+        <w:t>Mines</w:t>
+      </w:r>
+      <w:r>
+        <w:rPr>
+          <w:rFonts w:asciiTheme="majorHAnsi" w:hAnsiTheme="majorHAnsi" w:cstheme="majorHAnsi"/>
+          <w:highlight w:val="yellow"/>
+        </w:rPr>
+        <w:t xml:space="preserve"> – создаёт мину под собой, ограниченное макс число, урон </w:t>
+      </w:r>
+      <w:r>
+        <w:rPr>
+          <w:rFonts w:asciiTheme="majorHAnsi" w:hAnsiTheme="majorHAnsi" w:cstheme="majorHAnsi"/>
+          <w:highlight w:val="yellow"/>
+          <w:lang w:val="pl-PL"/>
+        </w:rPr>
+        <w:t>AoE</w:t>
+      </w:r>
+    </w:p>
+    <w:p>
+      <w:pPr>
+        <w:rPr>
+          <w:rFonts w:asciiTheme="majorHAnsi" w:hAnsiTheme="majorHAnsi" w:cstheme="majorHAnsi"/>
+        </w:rPr>
+      </w:pPr>
+      <w:r>
+        <w:rPr>
+          <w:rFonts w:asciiTheme="majorHAnsi" w:hAnsiTheme="majorHAnsi" w:cstheme="majorHAnsi"/>
+          <w:lang w:val="en-US"/>
+        </w:rPr>
+        <w:t>Multicharge</w:t>
+      </w:r>
+      <w:r>
+        <w:rPr>
+          <w:rFonts w:asciiTheme="majorHAnsi" w:hAnsiTheme="majorHAnsi" w:cstheme="majorHAnsi"/>
+        </w:rPr>
+        <w:t xml:space="preserve"> </w:t>
+      </w:r>
+      <w:r>
+        <w:rPr>
+          <w:rFonts w:asciiTheme="majorHAnsi" w:hAnsiTheme="majorHAnsi" w:cstheme="majorHAnsi"/>
+          <w:lang w:val="en-US"/>
+        </w:rPr>
+        <w:t>Mines</w:t>
+      </w:r>
+      <w:r>
+        <w:rPr>
+          <w:rFonts w:asciiTheme="majorHAnsi" w:hAnsiTheme="majorHAnsi" w:cstheme="majorHAnsi"/>
+        </w:rPr>
+        <w:t xml:space="preserve"> - апгрейд из фулл прокачанного </w:t>
+      </w:r>
+      <w:r>
+        <w:rPr>
+          <w:rFonts w:asciiTheme="majorHAnsi" w:hAnsiTheme="majorHAnsi" w:cstheme="majorHAnsi"/>
+          <w:lang w:val="en-US"/>
+        </w:rPr>
+        <w:t>Mines</w:t>
+      </w:r>
+      <w:r>
+        <w:rPr>
+          <w:rFonts w:asciiTheme="majorHAnsi" w:hAnsiTheme="majorHAnsi" w:cstheme="majorHAnsi"/>
+        </w:rPr>
+        <w:t>, каждая мина может взрыватся неограниченное колво раз, пока не заменится новой</w:t>
+      </w:r>
+    </w:p>
+    <w:p>
+      <w:pPr>
+        <w:rPr>
+          <w:rFonts w:asciiTheme="majorHAnsi" w:hAnsiTheme="majorHAnsi" w:cstheme="majorHAnsi"/>
+        </w:rPr>
+      </w:pPr>
+      <w:r>
+        <w:rPr>
+          <w:rFonts w:asciiTheme="majorHAnsi" w:hAnsiTheme="majorHAnsi" w:cstheme="majorHAnsi"/>
+          <w:lang w:val="pl-PL"/>
+        </w:rPr>
+        <w:t>Nanite</w:t>
+      </w:r>
+      <w:r>
+        <w:rPr>
+          <w:rFonts w:asciiTheme="majorHAnsi" w:hAnsiTheme="majorHAnsi" w:cstheme="majorHAnsi"/>
+        </w:rPr>
+        <w:t xml:space="preserve"> </w:t>
+      </w:r>
+      <w:r>
+        <w:rPr>
+          <w:rFonts w:asciiTheme="majorHAnsi" w:hAnsiTheme="majorHAnsi" w:cstheme="majorHAnsi"/>
+          <w:lang w:val="pl-PL"/>
+        </w:rPr>
+        <w:t>Bombs</w:t>
+      </w:r>
+      <w:r>
+        <w:rPr>
+          <w:rFonts w:asciiTheme="majorHAnsi" w:hAnsiTheme="majorHAnsi" w:cstheme="majorHAnsi"/>
+        </w:rPr>
+        <w:t xml:space="preserve"> - апгрейд из фулл прокачанного </w:t>
+      </w:r>
+      <w:r>
+        <w:rPr>
+          <w:rFonts w:asciiTheme="majorHAnsi" w:hAnsiTheme="majorHAnsi" w:cstheme="majorHAnsi"/>
+          <w:lang w:val="en-US"/>
+        </w:rPr>
+        <w:t>Mines</w:t>
+      </w:r>
+      <w:r>
+        <w:rPr>
+          <w:rFonts w:asciiTheme="majorHAnsi" w:hAnsiTheme="majorHAnsi" w:cstheme="majorHAnsi"/>
+        </w:rPr>
+        <w:t>, мины оглушают на короткое время, а также накладывают эффект наносящий урон со временем</w:t>
+      </w:r>
     </w:p>
     <w:p>
       <w:pPr>
@@ -2243,82 +3130,27 @@
           <w:rFonts w:cstheme="majorHAnsi"/>
         </w:rPr>
       </w:pPr>
-      <w:bookmarkStart w:id="13" w:name="_Toc232347209"/>
+      <w:bookmarkStart w:id="14" w:name="_Toc232347210"/>
       <w:r>
         <w:rPr>
           <w:rFonts w:cstheme="majorHAnsi"/>
         </w:rPr>
-        <w:t>Оружие</w:t>
-      </w:r>
-      <w:bookmarkEnd w:id="13"/>
-    </w:p>
-    <w:p>
-      <w:pPr>
-        <w:rPr>
-          <w:rFonts w:asciiTheme="majorHAnsi" w:hAnsiTheme="majorHAnsi" w:cstheme="majorHAnsi"/>
-        </w:rPr>
-      </w:pPr>
-      <w:r>
-        <w:rPr>
-          <w:rFonts w:asciiTheme="majorHAnsi" w:hAnsiTheme="majorHAnsi" w:cstheme="majorHAnsi"/>
-          <w:highlight w:val="yellow"/>
-          <w:lang w:val="pl-PL"/>
-        </w:rPr>
-        <w:t>Cannon</w:t>
-      </w:r>
-      <w:r>
-        <w:rPr>
-          <w:rFonts w:asciiTheme="majorHAnsi" w:hAnsiTheme="majorHAnsi" w:cstheme="majorHAnsi"/>
-          <w:highlight w:val="yellow"/>
-        </w:rPr>
-        <w:t xml:space="preserve"> – простая пушка, стреляет в ближайшего врага</w:t>
-      </w:r>
-    </w:p>
-    <w:p>
-      <w:pPr>
-        <w:rPr>
-          <w:rFonts w:asciiTheme="majorHAnsi" w:hAnsiTheme="majorHAnsi" w:cstheme="majorHAnsi"/>
-        </w:rPr>
-      </w:pPr>
-      <w:r>
-        <w:rPr>
-          <w:rFonts w:asciiTheme="majorHAnsi" w:hAnsiTheme="majorHAnsi" w:cstheme="majorHAnsi"/>
-          <w:lang w:val="pl-PL"/>
-        </w:rPr>
-        <w:t>Minigun</w:t>
-      </w:r>
-      <w:r>
-        <w:rPr>
-          <w:rFonts w:asciiTheme="majorHAnsi" w:hAnsiTheme="majorHAnsi" w:cstheme="majorHAnsi"/>
-        </w:rPr>
-        <w:t xml:space="preserve"> - апгрейд из фулл прокачанного </w:t>
-      </w:r>
-      <w:r>
-        <w:rPr>
-          <w:rFonts w:asciiTheme="majorHAnsi" w:hAnsiTheme="majorHAnsi" w:cstheme="majorHAnsi"/>
-          <w:lang w:val="pl-PL"/>
-        </w:rPr>
-        <w:t>Cannon</w:t>
-      </w:r>
-      <w:r>
-        <w:rPr>
-          <w:rFonts w:asciiTheme="majorHAnsi" w:hAnsiTheme="majorHAnsi" w:cstheme="majorHAnsi"/>
-        </w:rPr>
-        <w:t xml:space="preserve"> – стреляет быстро в ближайшего врага, меньший радус обнаружения, быстрые пули</w:t>
-      </w:r>
-    </w:p>
-    <w:p>
-      <w:pPr>
-        <w:rPr>
-          <w:rFonts w:asciiTheme="majorHAnsi" w:hAnsiTheme="majorHAnsi" w:cstheme="majorHAnsi"/>
-        </w:rPr>
-      </w:pPr>
-      <w:r>
-        <w:rPr>
-          <w:rFonts w:asciiTheme="majorHAnsi" w:hAnsiTheme="majorHAnsi" w:cstheme="majorHAnsi"/>
-          <w:lang w:val="pl-PL"/>
-        </w:rPr>
-        <w:t>Vacuum</w:t>
+        <w:t>Модули</w:t>
+      </w:r>
+      <w:bookmarkEnd w:id="14"/>
+    </w:p>
+    <w:p>
+      <w:pPr>
+        <w:rPr>
+          <w:rFonts w:asciiTheme="majorHAnsi" w:hAnsiTheme="majorHAnsi" w:cstheme="majorHAnsi"/>
+        </w:rPr>
+      </w:pPr>
+      <w:r>
+        <w:rPr>
+          <w:rFonts w:asciiTheme="majorHAnsi" w:hAnsiTheme="majorHAnsi" w:cstheme="majorHAnsi"/>
+          <w:lang w:val="pl-PL"/>
+        </w:rPr>
+        <w:t>Warp</w:t>
       </w:r>
       <w:r>
         <w:rPr>
@@ -2331,127 +3163,27 @@
           <w:rFonts w:asciiTheme="majorHAnsi" w:hAnsiTheme="majorHAnsi" w:cstheme="majorHAnsi"/>
           <w:lang w:val="pl-PL"/>
         </w:rPr>
-        <w:t>Cannon</w:t>
-      </w:r>
-      <w:r>
-        <w:rPr>
-          <w:rFonts w:asciiTheme="majorHAnsi" w:hAnsiTheme="majorHAnsi" w:cstheme="majorHAnsi"/>
-        </w:rPr>
-        <w:t xml:space="preserve"> - апгрейд из фулл прокачанного </w:t>
-      </w:r>
-      <w:r>
-        <w:rPr>
-          <w:rFonts w:asciiTheme="majorHAnsi" w:hAnsiTheme="majorHAnsi" w:cstheme="majorHAnsi"/>
-          <w:lang w:val="pl-PL"/>
-        </w:rPr>
-        <w:t>Cannon</w:t>
-      </w:r>
-      <w:r>
-        <w:rPr>
-          <w:rFonts w:asciiTheme="majorHAnsi" w:hAnsiTheme="majorHAnsi" w:cstheme="majorHAnsi"/>
-        </w:rPr>
-        <w:t xml:space="preserve"> – </w:t>
-      </w:r>
-      <w:r>
-        <w:rPr>
-          <w:rFonts w:asciiTheme="majorHAnsi" w:hAnsiTheme="majorHAnsi" w:cstheme="majorHAnsi"/>
-          <w:lang w:val="pl-PL"/>
-        </w:rPr>
-        <w:t>AoE</w:t>
-      </w:r>
-      <w:r>
-        <w:rPr>
-          <w:rFonts w:asciiTheme="majorHAnsi" w:hAnsiTheme="majorHAnsi" w:cstheme="majorHAnsi"/>
-        </w:rPr>
-        <w:t xml:space="preserve"> отталкивание противников </w:t>
-      </w:r>
-    </w:p>
-    <w:p>
-      <w:pPr>
-        <w:rPr>
-          <w:rFonts w:asciiTheme="majorHAnsi" w:hAnsiTheme="majorHAnsi" w:cstheme="majorHAnsi"/>
-        </w:rPr>
-      </w:pPr>
-      <w:r>
-        <w:rPr>
-          <w:rFonts w:asciiTheme="majorHAnsi" w:hAnsiTheme="majorHAnsi" w:cstheme="majorHAnsi"/>
-          <w:highlight w:val="yellow"/>
-          <w:lang w:val="pl-PL"/>
-        </w:rPr>
-        <w:t>Shotgun</w:t>
-      </w:r>
-      <w:r>
-        <w:rPr>
-          <w:rFonts w:asciiTheme="majorHAnsi" w:hAnsiTheme="majorHAnsi" w:cstheme="majorHAnsi"/>
-          <w:highlight w:val="yellow"/>
-        </w:rPr>
-        <w:t xml:space="preserve"> – дробовик, стреляет дробью в ближайшего врага</w:t>
-      </w:r>
-    </w:p>
-    <w:p>
-      <w:pPr>
-        <w:rPr>
-          <w:rFonts w:asciiTheme="majorHAnsi" w:hAnsiTheme="majorHAnsi" w:cstheme="majorHAnsi"/>
-        </w:rPr>
-      </w:pPr>
-      <w:r>
-        <w:rPr>
-          <w:rFonts w:asciiTheme="majorHAnsi" w:hAnsiTheme="majorHAnsi" w:cstheme="majorHAnsi"/>
-          <w:lang w:val="pl-PL"/>
-        </w:rPr>
-        <w:t>Eradicator</w:t>
-      </w:r>
-      <w:r>
-        <w:rPr>
-          <w:rFonts w:asciiTheme="majorHAnsi" w:hAnsiTheme="majorHAnsi" w:cstheme="majorHAnsi"/>
-        </w:rPr>
-        <w:t xml:space="preserve"> – апгрейд из фулл прокачанного </w:t>
-      </w:r>
-      <w:r>
-        <w:rPr>
-          <w:rFonts w:asciiTheme="majorHAnsi" w:hAnsiTheme="majorHAnsi" w:cstheme="majorHAnsi"/>
-          <w:lang w:val="pl-PL"/>
-        </w:rPr>
-        <w:t>Shotgun</w:t>
-      </w:r>
-      <w:r>
-        <w:rPr>
-          <w:rFonts w:asciiTheme="majorHAnsi" w:hAnsiTheme="majorHAnsi" w:cstheme="majorHAnsi"/>
-        </w:rPr>
-        <w:t xml:space="preserve"> – </w:t>
-      </w:r>
-      <w:r>
-        <w:rPr>
-          <w:rFonts w:asciiTheme="majorHAnsi" w:hAnsiTheme="majorHAnsi" w:cstheme="majorHAnsi"/>
-        </w:rPr>
-        <w:t xml:space="preserve">скорострельный дробовик - </w:t>
-      </w:r>
-      <w:r>
-        <w:rPr>
-          <w:rFonts w:asciiTheme="majorHAnsi" w:hAnsiTheme="majorHAnsi" w:cstheme="majorHAnsi"/>
-        </w:rPr>
-        <w:t xml:space="preserve">то же по сути что и </w:t>
-      </w:r>
-      <w:r>
-        <w:rPr>
-          <w:rFonts w:asciiTheme="majorHAnsi" w:hAnsiTheme="majorHAnsi" w:cstheme="majorHAnsi"/>
-          <w:lang w:val="pl-PL"/>
-        </w:rPr>
-        <w:t>Minigun</w:t>
-      </w:r>
-    </w:p>
-    <w:p>
-      <w:pPr>
-        <w:rPr>
-          <w:rFonts w:asciiTheme="majorHAnsi" w:hAnsiTheme="majorHAnsi" w:cstheme="majorHAnsi"/>
-        </w:rPr>
-      </w:pPr>
-      <w:r>
-        <w:rPr>
-          <w:rFonts w:asciiTheme="majorHAnsi" w:hAnsiTheme="majorHAnsi" w:cstheme="majorHAnsi"/>
-          <w:lang w:val="pl-PL"/>
-        </w:rPr>
-        <w:t>Octuple</w:t>
+        <w:t>Drive</w:t>
+      </w:r>
+      <w:r>
+        <w:rPr>
+          <w:rFonts w:asciiTheme="majorHAnsi" w:hAnsiTheme="majorHAnsi" w:cstheme="majorHAnsi"/>
+        </w:rPr>
+        <w:t xml:space="preserve"> – позволяет телепортироватся на некоторое расстояние. Апгрейды добавляют время неуязвимости и восстановление щитов после ТП</w:t>
+      </w:r>
+    </w:p>
+    <w:p>
+      <w:pPr>
+        <w:rPr>
+          <w:rFonts w:asciiTheme="majorHAnsi" w:hAnsiTheme="majorHAnsi" w:cstheme="majorHAnsi"/>
+        </w:rPr>
+      </w:pPr>
+      <w:r>
+        <w:rPr>
+          <w:rFonts w:asciiTheme="majorHAnsi" w:hAnsiTheme="majorHAnsi" w:cstheme="majorHAnsi"/>
+          <w:lang w:val="en-US"/>
+        </w:rPr>
+        <w:t>Burst</w:t>
       </w:r>
       <w:r>
         <w:rPr>
@@ -2462,758 +3194,85 @@
       <w:r>
         <w:rPr>
           <w:rFonts w:asciiTheme="majorHAnsi" w:hAnsiTheme="majorHAnsi" w:cstheme="majorHAnsi"/>
-          <w:lang w:val="pl-PL"/>
-        </w:rPr>
-        <w:t>Shotgun</w:t>
-      </w:r>
-      <w:r>
-        <w:rPr>
-          <w:rFonts w:asciiTheme="majorHAnsi" w:hAnsiTheme="majorHAnsi" w:cstheme="majorHAnsi"/>
-        </w:rPr>
-        <w:t xml:space="preserve"> – апгрейд из фулл прокачанного </w:t>
-      </w:r>
-      <w:r>
-        <w:rPr>
-          <w:rFonts w:asciiTheme="majorHAnsi" w:hAnsiTheme="majorHAnsi" w:cstheme="majorHAnsi"/>
-          <w:lang w:val="pl-PL"/>
-        </w:rPr>
-        <w:t>Shotgun</w:t>
-      </w:r>
-      <w:r>
-        <w:rPr>
-          <w:rFonts w:asciiTheme="majorHAnsi" w:hAnsiTheme="majorHAnsi" w:cstheme="majorHAnsi"/>
-        </w:rPr>
-        <w:t xml:space="preserve"> – восемь более слабых дробовиков, направленных во все стороны</w:t>
-      </w:r>
-    </w:p>
-    <w:p>
-      <w:pPr>
-        <w:rPr>
-          <w:rFonts w:asciiTheme="majorHAnsi" w:hAnsiTheme="majorHAnsi" w:cstheme="majorHAnsi"/>
-        </w:rPr>
-      </w:pPr>
-      <w:r>
-        <w:rPr>
-          <w:rFonts w:asciiTheme="majorHAnsi" w:hAnsiTheme="majorHAnsi" w:cstheme="majorHAnsi"/>
-          <w:highlight w:val="yellow"/>
-          <w:lang w:val="pl-PL"/>
-        </w:rPr>
-        <w:t>Missile</w:t>
-      </w:r>
-      <w:r>
-        <w:rPr>
-          <w:rFonts w:asciiTheme="majorHAnsi" w:hAnsiTheme="majorHAnsi" w:cstheme="majorHAnsi"/>
-          <w:highlight w:val="yellow"/>
-        </w:rPr>
-        <w:t xml:space="preserve"> – стреляет ракетой прямо</w:t>
-      </w:r>
-      <w:r>
-        <w:rPr>
-          <w:rFonts w:asciiTheme="majorHAnsi" w:hAnsiTheme="majorHAnsi" w:cstheme="majorHAnsi"/>
-          <w:highlight w:val="yellow"/>
-        </w:rPr>
-        <w:t>. Ракеты можно уничтожить пулей. Ракеты взрываются при попадании или спустя время. Апгрейд добавляет самонаводку.</w:t>
-      </w:r>
-    </w:p>
-    <w:p>
-      <w:pPr>
-        <w:rPr>
-          <w:rFonts w:asciiTheme="majorHAnsi" w:hAnsiTheme="majorHAnsi" w:cstheme="majorHAnsi"/>
-        </w:rPr>
-      </w:pPr>
-      <w:r>
-        <w:rPr>
-          <w:rFonts w:asciiTheme="majorHAnsi" w:hAnsiTheme="majorHAnsi" w:cstheme="majorHAnsi"/>
-          <w:lang w:val="pl-PL"/>
-        </w:rPr>
-        <w:t>Rocket</w:t>
-      </w:r>
-      <w:r>
-        <w:rPr>
-          <w:rFonts w:asciiTheme="majorHAnsi" w:hAnsiTheme="majorHAnsi" w:cstheme="majorHAnsi"/>
-        </w:rPr>
-        <w:t xml:space="preserve"> </w:t>
-      </w:r>
-      <w:r>
-        <w:rPr>
-          <w:rFonts w:asciiTheme="majorHAnsi" w:hAnsiTheme="majorHAnsi" w:cstheme="majorHAnsi"/>
-          <w:lang w:val="pl-PL"/>
-        </w:rPr>
-        <w:t>Swarm</w:t>
-      </w:r>
-      <w:r>
-        <w:rPr>
-          <w:rFonts w:asciiTheme="majorHAnsi" w:hAnsiTheme="majorHAnsi" w:cstheme="majorHAnsi"/>
-        </w:rPr>
-        <w:t xml:space="preserve"> – апгрейд из фулл прокачанного </w:t>
-      </w:r>
-      <w:r>
-        <w:rPr>
-          <w:rFonts w:asciiTheme="majorHAnsi" w:hAnsiTheme="majorHAnsi" w:cstheme="majorHAnsi"/>
-          <w:lang w:val="pl-PL"/>
-        </w:rPr>
-        <w:t>Missile</w:t>
-      </w:r>
-      <w:r>
-        <w:rPr>
-          <w:rFonts w:asciiTheme="majorHAnsi" w:hAnsiTheme="majorHAnsi" w:cstheme="majorHAnsi"/>
-        </w:rPr>
-        <w:t xml:space="preserve"> – стреляет множеством маленьких и быстрых ракет</w:t>
-      </w:r>
-    </w:p>
-    <w:p>
-      <w:pPr>
-        <w:rPr>
-          <w:rFonts w:asciiTheme="majorHAnsi" w:hAnsiTheme="majorHAnsi" w:cstheme="majorHAnsi"/>
-        </w:rPr>
-      </w:pPr>
-      <w:r>
-        <w:rPr>
-          <w:rFonts w:asciiTheme="majorHAnsi" w:hAnsiTheme="majorHAnsi" w:cstheme="majorHAnsi"/>
-          <w:lang w:val="pl-PL"/>
-        </w:rPr>
-        <w:t>Nuke</w:t>
-      </w:r>
-      <w:r>
-        <w:rPr>
-          <w:rFonts w:asciiTheme="majorHAnsi" w:hAnsiTheme="majorHAnsi" w:cstheme="majorHAnsi"/>
-        </w:rPr>
-        <w:t xml:space="preserve"> - апгрейд из фулл прокачанного </w:t>
-      </w:r>
-      <w:r>
-        <w:rPr>
-          <w:rFonts w:asciiTheme="majorHAnsi" w:hAnsiTheme="majorHAnsi" w:cstheme="majorHAnsi"/>
-          <w:lang w:val="pl-PL"/>
-        </w:rPr>
-        <w:t>Missile</w:t>
-      </w:r>
-      <w:r>
-        <w:rPr>
-          <w:rFonts w:asciiTheme="majorHAnsi" w:hAnsiTheme="majorHAnsi" w:cstheme="majorHAnsi"/>
-        </w:rPr>
-        <w:t xml:space="preserve"> – редко стреляет одной бомбой с огромным уроном, и оставляющей за собой ядовитую для всех зону</w:t>
-      </w:r>
-    </w:p>
-    <w:p>
-      <w:pPr>
-        <w:rPr>
-          <w:rFonts w:asciiTheme="majorHAnsi" w:hAnsiTheme="majorHAnsi" w:cstheme="majorHAnsi"/>
-        </w:rPr>
-      </w:pPr>
-      <w:r>
-        <w:rPr>
-          <w:rFonts w:asciiTheme="majorHAnsi" w:hAnsiTheme="majorHAnsi" w:cstheme="majorHAnsi"/>
-          <w:highlight w:val="yellow"/>
-          <w:lang w:val="pl-PL"/>
+          <w:lang w:val="en-US"/>
+        </w:rPr>
+        <w:t>Thruster</w:t>
+      </w:r>
+    </w:p>
+    <w:p>
+      <w:pPr>
+        <w:rPr>
+          <w:rFonts w:asciiTheme="majorHAnsi" w:hAnsiTheme="majorHAnsi" w:cstheme="majorHAnsi"/>
+          <w:lang w:val="en-US"/>
+        </w:rPr>
+      </w:pPr>
+      <w:r>
+        <w:rPr>
+          <w:rFonts w:asciiTheme="majorHAnsi" w:hAnsiTheme="majorHAnsi" w:cstheme="majorHAnsi"/>
+          <w:lang w:val="en-US"/>
+        </w:rPr>
+        <w:t>A fast directional dash. Less “instant” than Blink, but better for active dodging and repositioning while still keeping momentum.</w:t>
+      </w:r>
+    </w:p>
+    <w:p>
+      <w:pPr>
+        <w:rPr>
+          <w:rFonts w:asciiTheme="majorHAnsi" w:hAnsiTheme="majorHAnsi" w:cstheme="majorHAnsi"/>
+          <w:lang w:val="en-US"/>
+        </w:rPr>
+      </w:pPr>
+    </w:p>
+    <w:p>
+      <w:pPr>
+        <w:rPr>
+          <w:rFonts w:asciiTheme="majorHAnsi" w:hAnsiTheme="majorHAnsi" w:cstheme="majorHAnsi"/>
+          <w:lang w:val="en-US"/>
+        </w:rPr>
+      </w:pPr>
+      <w:r>
+        <w:rPr>
+          <w:rFonts w:asciiTheme="majorHAnsi" w:hAnsiTheme="majorHAnsi" w:cstheme="majorHAnsi"/>
+          <w:lang w:val="en-US"/>
+        </w:rPr>
+        <w:t>Phase Shunt</w:t>
+      </w:r>
+    </w:p>
+    <w:p>
+      <w:pPr>
+        <w:rPr>
+          <w:rFonts w:asciiTheme="majorHAnsi" w:hAnsiTheme="majorHAnsi" w:cstheme="majorHAnsi"/>
+          <w:lang w:val="en-US"/>
+        </w:rPr>
+      </w:pPr>
+      <w:r>
+        <w:rPr>
+          <w:rFonts w:asciiTheme="majorHAnsi" w:hAnsiTheme="majorHAnsi" w:cstheme="majorHAnsi"/>
+          <w:lang w:val="en-US"/>
+        </w:rPr>
+        <w:t>Brief intangibility. The ship can pass through enemies and projectiles for a moment. Strong emergency tool, long cooldown.</w:t>
+      </w:r>
+    </w:p>
+    <w:p>
+      <w:pPr>
+        <w:rPr>
+          <w:rFonts w:asciiTheme="majorHAnsi" w:hAnsiTheme="majorHAnsi" w:cstheme="majorHAnsi"/>
+          <w:lang w:val="en-US"/>
+        </w:rPr>
+      </w:pPr>
+    </w:p>
+    <w:p>
+      <w:pPr>
+        <w:rPr>
+          <w:rFonts w:asciiTheme="majorHAnsi" w:hAnsiTheme="majorHAnsi" w:cstheme="majorHAnsi"/>
+          <w:lang w:val="en-US"/>
+        </w:rPr>
+      </w:pPr>
+      <w:r>
+        <w:rPr>
+          <w:rFonts w:asciiTheme="majorHAnsi" w:hAnsiTheme="majorHAnsi" w:cstheme="majorHAnsi"/>
+          <w:lang w:val="en-US"/>
         </w:rPr>
         <w:lastRenderedPageBreak/>
-        <w:t>Railgun</w:t>
-      </w:r>
-      <w:r>
-        <w:rPr>
-          <w:rFonts w:asciiTheme="majorHAnsi" w:hAnsiTheme="majorHAnsi" w:cstheme="majorHAnsi"/>
-          <w:highlight w:val="yellow"/>
-        </w:rPr>
-        <w:t xml:space="preserve"> – редко стреляет очень быстрым снарядом. Наводится в 15-45 градусах напротив себя.</w:t>
-      </w:r>
-      <w:r>
-        <w:rPr>
-          <w:rFonts w:asciiTheme="majorHAnsi" w:hAnsiTheme="majorHAnsi" w:cstheme="majorHAnsi"/>
-          <w:highlight w:val="yellow"/>
-        </w:rPr>
-        <w:t xml:space="preserve"> Апгрейды добавляют пробивание нескольких целей.</w:t>
-      </w:r>
-    </w:p>
-    <w:p>
-      <w:pPr>
-        <w:rPr>
-          <w:rFonts w:asciiTheme="majorHAnsi" w:hAnsiTheme="majorHAnsi" w:cstheme="majorHAnsi"/>
-        </w:rPr>
-      </w:pPr>
-      <w:r>
-        <w:rPr>
-          <w:rFonts w:asciiTheme="majorHAnsi" w:hAnsiTheme="majorHAnsi" w:cstheme="majorHAnsi"/>
-          <w:lang w:val="pl-PL"/>
-        </w:rPr>
-        <w:t>Particle</w:t>
-      </w:r>
-      <w:r>
-        <w:rPr>
-          <w:rFonts w:asciiTheme="majorHAnsi" w:hAnsiTheme="majorHAnsi" w:cstheme="majorHAnsi"/>
-        </w:rPr>
-        <w:t xml:space="preserve"> </w:t>
-      </w:r>
-      <w:r>
-        <w:rPr>
-          <w:rFonts w:asciiTheme="majorHAnsi" w:hAnsiTheme="majorHAnsi" w:cstheme="majorHAnsi"/>
-          <w:lang w:val="pl-PL"/>
-        </w:rPr>
-        <w:t>Accelerator</w:t>
-      </w:r>
-      <w:r>
-        <w:rPr>
-          <w:rFonts w:asciiTheme="majorHAnsi" w:hAnsiTheme="majorHAnsi" w:cstheme="majorHAnsi"/>
-        </w:rPr>
-        <w:t xml:space="preserve"> - апгрейд из фулл прокачанного </w:t>
-      </w:r>
-      <w:r>
-        <w:rPr>
-          <w:rFonts w:asciiTheme="majorHAnsi" w:hAnsiTheme="majorHAnsi" w:cstheme="majorHAnsi"/>
-          <w:lang w:val="pl-PL"/>
-        </w:rPr>
-        <w:t>Railgun</w:t>
-      </w:r>
-      <w:r>
-        <w:rPr>
-          <w:rFonts w:asciiTheme="majorHAnsi" w:hAnsiTheme="majorHAnsi" w:cstheme="majorHAnsi"/>
-        </w:rPr>
-        <w:t xml:space="preserve"> – бесконечное пробивание</w:t>
-      </w:r>
-    </w:p>
-    <w:p>
-      <w:pPr>
-        <w:rPr>
-          <w:rFonts w:asciiTheme="majorHAnsi" w:hAnsiTheme="majorHAnsi" w:cstheme="majorHAnsi"/>
-        </w:rPr>
-      </w:pPr>
-      <w:r>
-        <w:rPr>
-          <w:rFonts w:asciiTheme="majorHAnsi" w:hAnsiTheme="majorHAnsi" w:cstheme="majorHAnsi"/>
-          <w:lang w:val="pl-PL"/>
-        </w:rPr>
-        <w:t>Behemoth</w:t>
-      </w:r>
-      <w:r>
-        <w:rPr>
-          <w:rFonts w:asciiTheme="majorHAnsi" w:hAnsiTheme="majorHAnsi" w:cstheme="majorHAnsi"/>
-        </w:rPr>
-        <w:t xml:space="preserve"> </w:t>
-      </w:r>
-      <w:r>
-        <w:rPr>
-          <w:rFonts w:asciiTheme="majorHAnsi" w:hAnsiTheme="majorHAnsi" w:cstheme="majorHAnsi"/>
-          <w:lang w:val="pl-PL"/>
-        </w:rPr>
-        <w:t>Rifle</w:t>
-      </w:r>
-      <w:r>
-        <w:rPr>
-          <w:rFonts w:asciiTheme="majorHAnsi" w:hAnsiTheme="majorHAnsi" w:cstheme="majorHAnsi"/>
-        </w:rPr>
-        <w:t xml:space="preserve"> - апгрейд из фулл прокачанного </w:t>
-      </w:r>
-      <w:r>
-        <w:rPr>
-          <w:rFonts w:asciiTheme="majorHAnsi" w:hAnsiTheme="majorHAnsi" w:cstheme="majorHAnsi"/>
-          <w:lang w:val="pl-PL"/>
-        </w:rPr>
-        <w:t>Railgun</w:t>
-      </w:r>
-      <w:r>
-        <w:rPr>
-          <w:rFonts w:asciiTheme="majorHAnsi" w:hAnsiTheme="majorHAnsi" w:cstheme="majorHAnsi"/>
-        </w:rPr>
-        <w:t xml:space="preserve"> – стреляет только перед собой, дополнительный урон на основании ХП цели</w:t>
-      </w:r>
-    </w:p>
-    <w:p>
-      <w:pPr>
-        <w:rPr>
-          <w:rFonts w:asciiTheme="majorHAnsi" w:hAnsiTheme="majorHAnsi" w:cstheme="majorHAnsi"/>
-        </w:rPr>
-      </w:pPr>
-      <w:r>
-        <w:rPr>
-          <w:rFonts w:asciiTheme="majorHAnsi" w:hAnsiTheme="majorHAnsi" w:cstheme="majorHAnsi"/>
-          <w:highlight w:val="yellow"/>
-          <w:lang w:val="pl-PL"/>
-        </w:rPr>
-        <w:t>Laser</w:t>
-      </w:r>
-      <w:r>
-        <w:rPr>
-          <w:rFonts w:asciiTheme="majorHAnsi" w:hAnsiTheme="majorHAnsi" w:cstheme="majorHAnsi"/>
-          <w:highlight w:val="yellow"/>
-        </w:rPr>
-        <w:t xml:space="preserve"> – редко стреляет лучём вперёд, луч остаётся некоторое время и наносит дополнительный урон целям внутри него.</w:t>
-      </w:r>
-    </w:p>
-    <w:p>
-      <w:pPr>
-        <w:rPr>
-          <w:rFonts w:asciiTheme="majorHAnsi" w:hAnsiTheme="majorHAnsi" w:cstheme="majorHAnsi"/>
-        </w:rPr>
-      </w:pPr>
-      <w:r>
-        <w:rPr>
-          <w:rFonts w:asciiTheme="majorHAnsi" w:hAnsiTheme="majorHAnsi" w:cstheme="majorHAnsi"/>
-          <w:lang w:val="pl-PL"/>
-        </w:rPr>
-        <w:t>Prism</w:t>
-      </w:r>
-      <w:r>
-        <w:rPr>
-          <w:rFonts w:asciiTheme="majorHAnsi" w:hAnsiTheme="majorHAnsi" w:cstheme="majorHAnsi"/>
-        </w:rPr>
-        <w:t xml:space="preserve"> - апгрейд из фулл прокачанного </w:t>
-      </w:r>
-      <w:r>
-        <w:rPr>
-          <w:rFonts w:asciiTheme="majorHAnsi" w:hAnsiTheme="majorHAnsi" w:cstheme="majorHAnsi"/>
-          <w:lang w:val="pl-PL"/>
-        </w:rPr>
-        <w:t>Laser</w:t>
-      </w:r>
-      <w:r>
-        <w:rPr>
-          <w:rFonts w:asciiTheme="majorHAnsi" w:hAnsiTheme="majorHAnsi" w:cstheme="majorHAnsi"/>
-        </w:rPr>
-        <w:t>, стреляет 3 раза, быстрее перезарядка и целится в 45 градусов перед собой</w:t>
-      </w:r>
-    </w:p>
-    <w:p>
-      <w:pPr>
-        <w:rPr>
-          <w:rFonts w:asciiTheme="majorHAnsi" w:hAnsiTheme="majorHAnsi" w:cstheme="majorHAnsi"/>
-        </w:rPr>
-      </w:pPr>
-      <w:r>
-        <w:rPr>
-          <w:rFonts w:asciiTheme="majorHAnsi" w:hAnsiTheme="majorHAnsi" w:cstheme="majorHAnsi"/>
-          <w:lang w:val="pl-PL"/>
-        </w:rPr>
-        <w:t>Blue</w:t>
-      </w:r>
-      <w:r>
-        <w:rPr>
-          <w:rFonts w:asciiTheme="majorHAnsi" w:hAnsiTheme="majorHAnsi" w:cstheme="majorHAnsi"/>
-        </w:rPr>
-        <w:t xml:space="preserve"> </w:t>
-      </w:r>
-      <w:r>
-        <w:rPr>
-          <w:rFonts w:asciiTheme="majorHAnsi" w:hAnsiTheme="majorHAnsi" w:cstheme="majorHAnsi"/>
-          <w:lang w:val="pl-PL"/>
-        </w:rPr>
-        <w:t>Laser</w:t>
-      </w:r>
-      <w:r>
-        <w:rPr>
-          <w:rFonts w:asciiTheme="majorHAnsi" w:hAnsiTheme="majorHAnsi" w:cstheme="majorHAnsi"/>
-        </w:rPr>
-        <w:t xml:space="preserve"> - апгрейд из фулл прокачанного </w:t>
-      </w:r>
-      <w:r>
-        <w:rPr>
-          <w:rFonts w:asciiTheme="majorHAnsi" w:hAnsiTheme="majorHAnsi" w:cstheme="majorHAnsi"/>
-          <w:lang w:val="pl-PL"/>
-        </w:rPr>
-        <w:t>Laser</w:t>
-      </w:r>
-      <w:r>
-        <w:rPr>
-          <w:rFonts w:asciiTheme="majorHAnsi" w:hAnsiTheme="majorHAnsi" w:cstheme="majorHAnsi"/>
-        </w:rPr>
-        <w:t>, игнорирует щиты, дополнительный урон на основании текущего уровня щитов</w:t>
-      </w:r>
-      <w:r>
-        <w:rPr>
-          <w:rFonts w:asciiTheme="majorHAnsi" w:hAnsiTheme="majorHAnsi" w:cstheme="majorHAnsi"/>
-        </w:rPr>
-        <w:t xml:space="preserve"> врага</w:t>
-      </w:r>
-    </w:p>
-    <w:p>
-      <w:pPr>
-        <w:rPr>
-          <w:rFonts w:asciiTheme="majorHAnsi" w:hAnsiTheme="majorHAnsi" w:cstheme="majorHAnsi"/>
-        </w:rPr>
-      </w:pPr>
-      <w:r>
-        <w:rPr>
-          <w:rFonts w:asciiTheme="majorHAnsi" w:hAnsiTheme="majorHAnsi" w:cstheme="majorHAnsi"/>
-          <w:highlight w:val="yellow"/>
-          <w:lang w:val="pl-PL"/>
-        </w:rPr>
-        <w:t>Tesla</w:t>
-      </w:r>
-      <w:r>
-        <w:rPr>
-          <w:rFonts w:asciiTheme="majorHAnsi" w:hAnsiTheme="majorHAnsi" w:cstheme="majorHAnsi"/>
-          <w:highlight w:val="yellow"/>
-        </w:rPr>
-        <w:t xml:space="preserve"> – Средняя скорострельность, молния перескакивает между 3/4/5 врагами, увеличенный урон щитам</w:t>
-      </w:r>
-    </w:p>
-    <w:p>
-      <w:pPr>
-        <w:rPr>
-          <w:rFonts w:asciiTheme="majorHAnsi" w:hAnsiTheme="majorHAnsi" w:cstheme="majorHAnsi"/>
-        </w:rPr>
-      </w:pPr>
-      <w:r>
-        <w:rPr>
-          <w:rFonts w:asciiTheme="majorHAnsi" w:hAnsiTheme="majorHAnsi" w:cstheme="majorHAnsi"/>
-          <w:lang w:val="pl-PL"/>
-        </w:rPr>
-        <w:t>Shock</w:t>
-      </w:r>
-      <w:r>
-        <w:rPr>
-          <w:rFonts w:asciiTheme="majorHAnsi" w:hAnsiTheme="majorHAnsi" w:cstheme="majorHAnsi"/>
-        </w:rPr>
-        <w:t xml:space="preserve"> </w:t>
-      </w:r>
-      <w:r>
-        <w:rPr>
-          <w:rFonts w:asciiTheme="majorHAnsi" w:hAnsiTheme="majorHAnsi" w:cstheme="majorHAnsi"/>
-          <w:lang w:val="pl-PL"/>
-        </w:rPr>
-        <w:t>Field</w:t>
-      </w:r>
-      <w:r>
-        <w:rPr>
-          <w:rFonts w:asciiTheme="majorHAnsi" w:hAnsiTheme="majorHAnsi" w:cstheme="majorHAnsi"/>
-        </w:rPr>
-        <w:t xml:space="preserve"> - апгрейд из фулл прокачанного </w:t>
-      </w:r>
-      <w:r>
-        <w:rPr>
-          <w:rFonts w:asciiTheme="majorHAnsi" w:hAnsiTheme="majorHAnsi" w:cstheme="majorHAnsi"/>
-          <w:lang w:val="pl-PL"/>
-        </w:rPr>
-        <w:t>Tesla</w:t>
-      </w:r>
-      <w:r>
-        <w:rPr>
-          <w:rFonts w:asciiTheme="majorHAnsi" w:hAnsiTheme="majorHAnsi" w:cstheme="majorHAnsi"/>
-        </w:rPr>
-        <w:t xml:space="preserve">, редко бьёт и оглушает всё вокруг себя </w:t>
-      </w:r>
-    </w:p>
-    <w:p>
-      <w:pPr>
-        <w:rPr>
-          <w:rFonts w:asciiTheme="majorHAnsi" w:hAnsiTheme="majorHAnsi" w:cstheme="majorHAnsi"/>
-        </w:rPr>
-      </w:pPr>
-      <w:r>
-        <w:rPr>
-          <w:rFonts w:asciiTheme="majorHAnsi" w:hAnsiTheme="majorHAnsi" w:cstheme="majorHAnsi"/>
-          <w:lang w:val="pl-PL"/>
-        </w:rPr>
-        <w:t>Thunder</w:t>
-      </w:r>
-      <w:r>
-        <w:rPr>
-          <w:rFonts w:asciiTheme="majorHAnsi" w:hAnsiTheme="majorHAnsi" w:cstheme="majorHAnsi"/>
-        </w:rPr>
-        <w:t xml:space="preserve"> </w:t>
-      </w:r>
-      <w:r>
-        <w:rPr>
-          <w:rFonts w:asciiTheme="majorHAnsi" w:hAnsiTheme="majorHAnsi" w:cstheme="majorHAnsi"/>
-          <w:lang w:val="pl-PL"/>
-        </w:rPr>
-        <w:t>spear</w:t>
-      </w:r>
-      <w:r>
-        <w:rPr>
-          <w:rFonts w:asciiTheme="majorHAnsi" w:hAnsiTheme="majorHAnsi" w:cstheme="majorHAnsi"/>
-        </w:rPr>
-        <w:t xml:space="preserve"> - апгрейд из фулл прокачанного </w:t>
-      </w:r>
-      <w:r>
-        <w:rPr>
-          <w:rFonts w:asciiTheme="majorHAnsi" w:hAnsiTheme="majorHAnsi" w:cstheme="majorHAnsi"/>
-          <w:lang w:val="pl-PL"/>
-        </w:rPr>
-        <w:t>Tesla</w:t>
-      </w:r>
-      <w:r>
-        <w:rPr>
-          <w:rFonts w:asciiTheme="majorHAnsi" w:hAnsiTheme="majorHAnsi" w:cstheme="majorHAnsi"/>
-        </w:rPr>
-        <w:t>, выбирает цель с самым большим максимальным уровнем щитов, продолжает бить п</w:t>
-      </w:r>
-      <w:r>
-        <w:rPr>
-          <w:rFonts w:asciiTheme="majorHAnsi" w:hAnsiTheme="majorHAnsi" w:cstheme="majorHAnsi"/>
-        </w:rPr>
-        <w:t>ока не убьёт, постоянно оглушая</w:t>
-      </w:r>
-    </w:p>
-    <w:p>
-      <w:pPr>
-        <w:rPr>
-          <w:rFonts w:asciiTheme="majorHAnsi" w:hAnsiTheme="majorHAnsi" w:cstheme="majorHAnsi"/>
-        </w:rPr>
-      </w:pPr>
-      <w:r>
-        <w:rPr>
-          <w:rFonts w:asciiTheme="majorHAnsi" w:hAnsiTheme="majorHAnsi" w:cstheme="majorHAnsi"/>
-          <w:highlight w:val="yellow"/>
-          <w:lang w:val="pl-PL"/>
-        </w:rPr>
-        <w:t>Mines</w:t>
-      </w:r>
-      <w:r>
-        <w:rPr>
-          <w:rFonts w:asciiTheme="majorHAnsi" w:hAnsiTheme="majorHAnsi" w:cstheme="majorHAnsi"/>
-          <w:highlight w:val="yellow"/>
-        </w:rPr>
-        <w:t xml:space="preserve"> – создаёт мину под собой, ограниченное макс число, урон </w:t>
-      </w:r>
-      <w:r>
-        <w:rPr>
-          <w:rFonts w:asciiTheme="majorHAnsi" w:hAnsiTheme="majorHAnsi" w:cstheme="majorHAnsi"/>
-          <w:highlight w:val="yellow"/>
-          <w:lang w:val="pl-PL"/>
-        </w:rPr>
-        <w:t>AoE</w:t>
-      </w:r>
-    </w:p>
-    <w:p>
-      <w:pPr>
-        <w:rPr>
-          <w:rFonts w:asciiTheme="majorHAnsi" w:hAnsiTheme="majorHAnsi" w:cstheme="majorHAnsi"/>
-        </w:rPr>
-      </w:pPr>
-      <w:r>
-        <w:rPr>
-          <w:rFonts w:asciiTheme="majorHAnsi" w:hAnsiTheme="majorHAnsi" w:cstheme="majorHAnsi"/>
-          <w:lang w:val="en-US"/>
-        </w:rPr>
-        <w:t>Multicharge</w:t>
-      </w:r>
-      <w:r>
-        <w:rPr>
-          <w:rFonts w:asciiTheme="majorHAnsi" w:hAnsiTheme="majorHAnsi" w:cstheme="majorHAnsi"/>
-        </w:rPr>
-        <w:t xml:space="preserve"> </w:t>
-      </w:r>
-      <w:r>
-        <w:rPr>
-          <w:rFonts w:asciiTheme="majorHAnsi" w:hAnsiTheme="majorHAnsi" w:cstheme="majorHAnsi"/>
-          <w:lang w:val="en-US"/>
-        </w:rPr>
-        <w:t>Mines</w:t>
-      </w:r>
-      <w:r>
-        <w:rPr>
-          <w:rFonts w:asciiTheme="majorHAnsi" w:hAnsiTheme="majorHAnsi" w:cstheme="majorHAnsi"/>
-        </w:rPr>
-        <w:t xml:space="preserve"> - апгрейд из фулл прокачанного </w:t>
-      </w:r>
-      <w:r>
-        <w:rPr>
-          <w:rFonts w:asciiTheme="majorHAnsi" w:hAnsiTheme="majorHAnsi" w:cstheme="majorHAnsi"/>
-          <w:lang w:val="en-US"/>
-        </w:rPr>
-        <w:t>Mines</w:t>
-      </w:r>
-      <w:r>
-        <w:rPr>
-          <w:rFonts w:asciiTheme="majorHAnsi" w:hAnsiTheme="majorHAnsi" w:cstheme="majorHAnsi"/>
-        </w:rPr>
-        <w:t>, каждая мина может взрыватся неограниченное колво раз, пока не заменится новой</w:t>
-      </w:r>
-    </w:p>
-    <w:p>
-      <w:pPr>
-        <w:rPr>
-          <w:rFonts w:asciiTheme="majorHAnsi" w:hAnsiTheme="majorHAnsi" w:cstheme="majorHAnsi"/>
-        </w:rPr>
-      </w:pPr>
-      <w:r>
-        <w:rPr>
-          <w:rFonts w:asciiTheme="majorHAnsi" w:hAnsiTheme="majorHAnsi" w:cstheme="majorHAnsi"/>
-          <w:lang w:val="pl-PL"/>
-        </w:rPr>
-        <w:t>Nanite</w:t>
-      </w:r>
-      <w:r>
-        <w:rPr>
-          <w:rFonts w:asciiTheme="majorHAnsi" w:hAnsiTheme="majorHAnsi" w:cstheme="majorHAnsi"/>
-        </w:rPr>
-        <w:t xml:space="preserve"> </w:t>
-      </w:r>
-      <w:r>
-        <w:rPr>
-          <w:rFonts w:asciiTheme="majorHAnsi" w:hAnsiTheme="majorHAnsi" w:cstheme="majorHAnsi"/>
-          <w:lang w:val="pl-PL"/>
-        </w:rPr>
-        <w:t>Bombs</w:t>
-      </w:r>
-      <w:r>
-        <w:rPr>
-          <w:rFonts w:asciiTheme="majorHAnsi" w:hAnsiTheme="majorHAnsi" w:cstheme="majorHAnsi"/>
-        </w:rPr>
-        <w:t xml:space="preserve"> - апгрейд из фулл прокачанного </w:t>
-      </w:r>
-      <w:r>
-        <w:rPr>
-          <w:rFonts w:asciiTheme="majorHAnsi" w:hAnsiTheme="majorHAnsi" w:cstheme="majorHAnsi"/>
-          <w:lang w:val="en-US"/>
-        </w:rPr>
-        <w:t>Mines</w:t>
-      </w:r>
-      <w:r>
-        <w:rPr>
-          <w:rFonts w:asciiTheme="majorHAnsi" w:hAnsiTheme="majorHAnsi" w:cstheme="majorHAnsi"/>
-        </w:rPr>
-        <w:t>, мины оглушают на короткое время, а также накладывают эффект наносящий урон со временем</w:t>
-      </w:r>
-    </w:p>
-    <w:p>
-      <w:pPr>
-        <w:pStyle w:val="2"/>
-        <w:rPr>
-          <w:rFonts w:cstheme="majorHAnsi"/>
-        </w:rPr>
-      </w:pPr>
-      <w:bookmarkStart w:id="14" w:name="_Toc232347210"/>
-      <w:r>
-        <w:rPr>
-          <w:rFonts w:cstheme="majorHAnsi"/>
-        </w:rPr>
-        <w:t>Модули</w:t>
-      </w:r>
-      <w:bookmarkEnd w:id="14"/>
-    </w:p>
-    <w:p>
-      <w:pPr>
-        <w:rPr>
-          <w:rFonts w:asciiTheme="majorHAnsi" w:hAnsiTheme="majorHAnsi" w:cstheme="majorHAnsi"/>
-        </w:rPr>
-      </w:pPr>
-      <w:r>
-        <w:rPr>
-          <w:rFonts w:asciiTheme="majorHAnsi" w:hAnsiTheme="majorHAnsi" w:cstheme="majorHAnsi"/>
-          <w:lang w:val="pl-PL"/>
-        </w:rPr>
-        <w:t>Warp</w:t>
-      </w:r>
-      <w:r>
-        <w:rPr>
-          <w:rFonts w:asciiTheme="majorHAnsi" w:hAnsiTheme="majorHAnsi" w:cstheme="majorHAnsi"/>
-        </w:rPr>
-        <w:t xml:space="preserve"> </w:t>
-      </w:r>
-      <w:r>
-        <w:rPr>
-          <w:rFonts w:asciiTheme="majorHAnsi" w:hAnsiTheme="majorHAnsi" w:cstheme="majorHAnsi"/>
-          <w:lang w:val="pl-PL"/>
-        </w:rPr>
-        <w:t>Drive</w:t>
-      </w:r>
-      <w:r>
-        <w:rPr>
-          <w:rFonts w:asciiTheme="majorHAnsi" w:hAnsiTheme="majorHAnsi" w:cstheme="majorHAnsi"/>
-        </w:rPr>
-        <w:t xml:space="preserve"> – позволяет телепортироватся на некоторое расстояние. Апгрейды добавляют время неуязвимости и восстановление щитов после ТП</w:t>
-      </w:r>
-    </w:p>
-    <w:p>
-      <w:pPr>
-        <w:rPr>
-          <w:rFonts w:asciiTheme="majorHAnsi" w:hAnsiTheme="majorHAnsi" w:cstheme="majorHAnsi"/>
-        </w:rPr>
-      </w:pPr>
-      <w:r>
-        <w:rPr>
-          <w:rFonts w:asciiTheme="majorHAnsi" w:hAnsiTheme="majorHAnsi" w:cstheme="majorHAnsi"/>
-          <w:lang w:val="en-US"/>
-        </w:rPr>
-        <w:t>Burst</w:t>
-      </w:r>
-      <w:r>
-        <w:rPr>
-          <w:rFonts w:asciiTheme="majorHAnsi" w:hAnsiTheme="majorHAnsi" w:cstheme="majorHAnsi"/>
-        </w:rPr>
-        <w:t xml:space="preserve"> </w:t>
-      </w:r>
-      <w:r>
-        <w:rPr>
-          <w:rFonts w:asciiTheme="majorHAnsi" w:hAnsiTheme="majorHAnsi" w:cstheme="majorHAnsi"/>
-          <w:lang w:val="en-US"/>
-        </w:rPr>
-        <w:t>Thruster</w:t>
-      </w:r>
-    </w:p>
-    <w:p>
-      <w:pPr>
-        <w:rPr>
-          <w:rFonts w:asciiTheme="majorHAnsi" w:hAnsiTheme="majorHAnsi" w:cstheme="majorHAnsi"/>
-          <w:lang w:val="en-US"/>
-        </w:rPr>
-      </w:pPr>
-      <w:r>
-        <w:rPr>
-          <w:rFonts w:asciiTheme="majorHAnsi" w:hAnsiTheme="majorHAnsi" w:cstheme="majorHAnsi"/>
-          <w:lang w:val="en-US"/>
-        </w:rPr>
-        <w:t>A fast directional dash. Less “instant” than Blink, but better for active dodging and repositioning while still keeping momentum.</w:t>
-      </w:r>
-    </w:p>
-    <w:p>
-      <w:pPr>
-        <w:rPr>
-          <w:rFonts w:asciiTheme="majorHAnsi" w:hAnsiTheme="majorHAnsi" w:cstheme="majorHAnsi"/>
-          <w:lang w:val="en-US"/>
-        </w:rPr>
-      </w:pPr>
-    </w:p>
-    <w:p>
-      <w:pPr>
-        <w:rPr>
-          <w:rFonts w:asciiTheme="majorHAnsi" w:hAnsiTheme="majorHAnsi" w:cstheme="majorHAnsi"/>
-          <w:lang w:val="en-US"/>
-        </w:rPr>
-      </w:pPr>
-      <w:r>
-        <w:rPr>
-          <w:rFonts w:asciiTheme="majorHAnsi" w:hAnsiTheme="majorHAnsi" w:cstheme="majorHAnsi"/>
-          <w:lang w:val="en-US"/>
-        </w:rPr>
-        <w:t>Phase Shunt</w:t>
-      </w:r>
-    </w:p>
-    <w:p>
-      <w:pPr>
-        <w:rPr>
-          <w:rFonts w:asciiTheme="majorHAnsi" w:hAnsiTheme="majorHAnsi" w:cstheme="majorHAnsi"/>
-          <w:lang w:val="en-US"/>
-        </w:rPr>
-      </w:pPr>
-      <w:r>
-        <w:rPr>
-          <w:rFonts w:asciiTheme="majorHAnsi" w:hAnsiTheme="majorHAnsi" w:cstheme="majorHAnsi"/>
-          <w:lang w:val="en-US"/>
-        </w:rPr>
-        <w:t>Brief intangibility. The ship can pass through enemies and projectiles for a moment. Strong emergency tool, long cooldown.</w:t>
-      </w:r>
-    </w:p>
-    <w:p>
-      <w:pPr>
-        <w:rPr>
-          <w:rFonts w:asciiTheme="majorHAnsi" w:hAnsiTheme="majorHAnsi" w:cstheme="majorHAnsi"/>
-          <w:lang w:val="en-US"/>
-        </w:rPr>
-      </w:pPr>
-    </w:p>
-    <w:p>
-      <w:pPr>
-        <w:rPr>
-          <w:rFonts w:asciiTheme="majorHAnsi" w:hAnsiTheme="majorHAnsi" w:cstheme="majorHAnsi"/>
-          <w:lang w:val="en-US"/>
-        </w:rPr>
-      </w:pPr>
-      <w:r>
-        <w:rPr>
-          <w:rFonts w:asciiTheme="majorHAnsi" w:hAnsiTheme="majorHAnsi" w:cstheme="majorHAnsi"/>
-          <w:lang w:val="en-US"/>
-        </w:rPr>
         <w:t>Cloak</w:t>
       </w:r>
     </w:p>
@@ -3267,7 +3326,6 @@
           <w:rFonts w:asciiTheme="majorHAnsi" w:hAnsiTheme="majorHAnsi" w:cstheme="majorHAnsi"/>
           <w:lang w:val="en-US"/>
         </w:rPr>
-        <w:lastRenderedPageBreak/>
         <w:t>Drops a fake ship or signature. Great for splitting enemy fire, especially against missile and sniper enemies.</w:t>
       </w:r>
     </w:p>
@@ -3712,6 +3770,7 @@
         <w:rPr>
           <w:rFonts w:asciiTheme="majorHAnsi" w:hAnsiTheme="majorHAnsi" w:cstheme="majorHAnsi"/>
         </w:rPr>
+        <w:lastRenderedPageBreak/>
         <w:t>Striker - Minigun + Burst Thruster</w:t>
       </w:r>
     </w:p>
@@ -3828,7 +3887,6 @@
         <w:rPr>
           <w:rFonts w:asciiTheme="majorHAnsi" w:hAnsiTheme="majorHAnsi" w:cstheme="majorHAnsi"/>
         </w:rPr>
-        <w:lastRenderedPageBreak/>
         <w:t>Harbinger - Cannon + Missile + Overdrive</w:t>
       </w:r>
     </w:p>
@@ -4465,6 +4523,7 @@
         <w:rPr>
           <w:rFonts w:asciiTheme="majorHAnsi" w:hAnsiTheme="majorHAnsi" w:cstheme="majorHAnsi"/>
         </w:rPr>
+        <w:lastRenderedPageBreak/>
         <w:t>Seeder - Multicharge Mines + Burst Thruster</w:t>
       </w:r>
     </w:p>
@@ -4575,7 +4634,6 @@
           <w:i/>
           <w:lang w:val="en-US"/>
         </w:rPr>
-        <w:lastRenderedPageBreak/>
         <w:t>Iron Reach</w:t>
       </w:r>
     </w:p>
@@ -5269,6 +5327,7 @@
           <w:rFonts w:asciiTheme="majorHAnsi" w:hAnsiTheme="majorHAnsi" w:cstheme="majorHAnsi"/>
           <w:lang w:val="en-US"/>
         </w:rPr>
+        <w:lastRenderedPageBreak/>
         <w:t>Tempest - Thunder Spear + Shock Field + Jammer</w:t>
       </w:r>
     </w:p>
@@ -6371,7 +6430,7 @@
 </file>
 
 <file path=customXml/itemProps1.xml><?xml version="1.0" encoding="utf-8"?>
-<ds:datastoreItem xmlns:ds="http://schemas.openxmlformats.org/officeDocument/2006/customXml" ds:itemID="{2C60EACA-AA4C-4C9A-B6E3-A4839728905F}">
+<ds:datastoreItem xmlns:ds="http://schemas.openxmlformats.org/officeDocument/2006/customXml" ds:itemID="{B11BDA69-5F1D-4E3C-92C8-337763191BCE}">
   <ds:schemaRefs>
     <ds:schemaRef ds:uri="http://schemas.openxmlformats.org/officeDocument/2006/bibliography"/>
   </ds:schemaRefs>

</xml_diff>